<commit_message>
paragrafo requisitos nao funcionais no docs
</commit_message>
<xml_diff>
--- a/docs/sistemas de gestão de finanças pessoais com metas - FINANÇAFACIL.docx
+++ b/docs/sistemas de gestão de finanças pessoais com metas - FINANÇAFACIL.docx
@@ -1396,27 +1396,42 @@
         <w:jc w:val="both"/>
         <w:rPr>
           <w:rFonts w:asciiTheme="minorHAnsi" w:hAnsiTheme="minorHAnsi" w:cstheme="minorHAnsi"/>
-          <w:color w:val="FF0000"/>
-          <w:szCs w:val="24"/>
-        </w:rPr>
-      </w:pPr>
-      <w:r>
-        <w:rPr>
-          <w:rFonts w:asciiTheme="minorHAnsi" w:hAnsiTheme="minorHAnsi" w:cstheme="minorHAnsi"/>
-          <w:color w:val="FF0000"/>
-          <w:szCs w:val="24"/>
-        </w:rPr>
-        <w:t>“Toda tabela deve legenda”</w:t>
-      </w:r>
-    </w:p>
-    <w:p>
-      <w:pPr>
-        <w:jc w:val="both"/>
-        <w:rPr>
-          <w:rFonts w:asciiTheme="minorHAnsi" w:hAnsiTheme="minorHAnsi" w:cstheme="minorHAnsi"/>
-          <w:szCs w:val="24"/>
-        </w:rPr>
-      </w:pPr>
+          <w:szCs w:val="24"/>
+        </w:rPr>
+      </w:pPr>
+    </w:p>
+    <w:p>
+      <w:pPr>
+        <w:jc w:val="both"/>
+        <w:rPr>
+          <w:rFonts w:asciiTheme="minorHAnsi" w:hAnsiTheme="minorHAnsi" w:cstheme="minorHAnsi"/>
+          <w:szCs w:val="24"/>
+        </w:rPr>
+      </w:pPr>
+      <w:r>
+        <w:rPr>
+          <w:rFonts w:asciiTheme="minorHAnsi" w:hAnsiTheme="minorHAnsi" w:cstheme="minorHAnsi"/>
+          <w:szCs w:val="24"/>
+        </w:rPr>
+        <w:t>2.2 Requisitos não funcionais</w:t>
+      </w:r>
+    </w:p>
+    <w:p>
+      <w:pPr>
+        <w:jc w:val="both"/>
+        <w:rPr>
+          <w:rFonts w:asciiTheme="minorHAnsi" w:hAnsiTheme="minorHAnsi" w:cstheme="minorHAnsi"/>
+          <w:szCs w:val="24"/>
+        </w:rPr>
+      </w:pPr>
+      <w:r>
+        <w:rPr>
+          <w:rFonts w:ascii="Helvetica" w:hAnsi="Helvetica" w:cs="Helvetica"/>
+        </w:rPr>
+        <w:t>A transformação precisa acontecer quase que de imediato, de maneira ágil e eficaz. Para garantir que os números mostrados sejam exatos, a ferramenta deve buscar dados em plataformas de câmbio sempre revisadas e de reputação sólida, prevenindo erros nos cálculos. Adicionalmente, a página precisa ser simples de usar, facilitando a escolha das moedas que serão convertidas, sem gerar confusão. O uso deve ser leve e direto, sem passos extras, fazendo com que qualquer pessoa consiga usar sem problemas. Para finalizar, o valor final da conversão deve ser exibido de forma organizada, nítida e fácil de entender, assegurando que o usuário compreenda o resultado na hora, sem precisar pensar muito.</w:t>
+      </w:r>
+      <w:bookmarkStart w:id="0" w:name="_GoBack"/>
+      <w:bookmarkEnd w:id="0"/>
     </w:p>
     <w:p>
       <w:pPr>
@@ -1882,7 +1897,7 @@
               </w:rPr>
               <w:t xml:space="preserve">Editar </w:t>
             </w:r>
-            <w:commentRangeStart w:id="0"/>
+            <w:commentRangeStart w:id="1"/>
             <w:r>
               <w:rPr>
                 <w:rFonts w:asciiTheme="minorHAnsi" w:hAnsiTheme="minorHAnsi" w:cstheme="minorHAnsi"/>
@@ -1890,12 +1905,12 @@
               </w:rPr>
               <w:t>Banco</w:t>
             </w:r>
-            <w:commentRangeEnd w:id="0"/>
+            <w:commentRangeEnd w:id="1"/>
             <w:r>
               <w:rPr>
                 <w:rStyle w:val="Refdecomentrio"/>
               </w:rPr>
-              <w:commentReference w:id="0"/>
+              <w:commentReference w:id="1"/>
             </w:r>
           </w:p>
         </w:tc>
@@ -1922,6 +1937,7 @@
                 <w:rFonts w:asciiTheme="minorHAnsi" w:hAnsiTheme="minorHAnsi" w:cstheme="minorHAnsi"/>
                 <w:szCs w:val="24"/>
               </w:rPr>
+              <w:lastRenderedPageBreak/>
               <w:t>RF009</w:t>
             </w:r>
           </w:p>
@@ -2201,15 +2217,7 @@
           <w:rFonts w:asciiTheme="minorHAnsi" w:hAnsiTheme="minorHAnsi" w:cstheme="minorHAnsi"/>
           <w:szCs w:val="24"/>
         </w:rPr>
-        <w:lastRenderedPageBreak/>
-        <w:t>Celular</w:t>
-      </w:r>
-      <w:r>
-        <w:rPr>
-          <w:rFonts w:asciiTheme="minorHAnsi" w:hAnsiTheme="minorHAnsi" w:cstheme="minorHAnsi"/>
-          <w:szCs w:val="24"/>
-        </w:rPr>
-        <w:t>.</w:t>
+        <w:t>Celular.</w:t>
       </w:r>
     </w:p>
     <w:p>
@@ -2672,6 +2680,7 @@
           <w:rFonts w:asciiTheme="minorHAnsi" w:hAnsiTheme="minorHAnsi" w:cstheme="minorHAnsi"/>
           <w:szCs w:val="24"/>
         </w:rPr>
+        <w:lastRenderedPageBreak/>
         <w:t>Processamento:</w:t>
       </w:r>
     </w:p>
@@ -2790,8 +2799,6 @@
         </w:rPr>
         <w:t>As alterações devem ser refletidas no cliente e nos seus registros.</w:t>
       </w:r>
-      <w:bookmarkStart w:id="1" w:name="_GoBack"/>
-      <w:bookmarkEnd w:id="1"/>
     </w:p>
     <w:p>
       <w:pPr>
@@ -2820,7 +2827,6 @@
           <w:bCs/>
           <w:szCs w:val="24"/>
         </w:rPr>
-        <w:lastRenderedPageBreak/>
         <w:t>2.3</w:t>
       </w:r>
       <w:r>
@@ -3124,15 +3130,7 @@
           <w:b/>
           <w:szCs w:val="24"/>
         </w:rPr>
-        <w:t xml:space="preserve">.4 </w:t>
-      </w:r>
-      <w:r>
-        <w:rPr>
-          <w:rFonts w:asciiTheme="minorHAnsi" w:hAnsiTheme="minorHAnsi" w:cstheme="minorHAnsi"/>
-          <w:b/>
-          <w:szCs w:val="24"/>
-        </w:rPr>
-        <w:t>RF004 – Cadastrar Meta</w:t>
+        <w:t>.4 RF004 – Cadastrar Meta</w:t>
       </w:r>
     </w:p>
     <w:p>
@@ -3207,6 +3205,7 @@
         <w:jc w:val="both"/>
       </w:pPr>
       <w:r>
+        <w:lastRenderedPageBreak/>
         <w:t>Nome da meta</w:t>
       </w:r>
       <w:r>
@@ -3359,7 +3358,6 @@
           <w:rFonts w:asciiTheme="minorHAnsi" w:hAnsiTheme="minorHAnsi" w:cstheme="minorHAnsi"/>
           <w:szCs w:val="24"/>
         </w:rPr>
-        <w:lastRenderedPageBreak/>
         <w:t>Mensagem</w:t>
       </w:r>
       <w:r>
@@ -3888,6 +3886,7 @@
           <w:rFonts w:asciiTheme="minorHAnsi" w:hAnsiTheme="minorHAnsi" w:cstheme="minorHAnsi"/>
           <w:szCs w:val="24"/>
         </w:rPr>
+        <w:lastRenderedPageBreak/>
         <w:t>Pós-condição:</w:t>
       </w:r>
     </w:p>
@@ -4141,7 +4140,6 @@
           <w:rFonts w:asciiTheme="minorHAnsi" w:hAnsiTheme="minorHAnsi" w:cstheme="minorHAnsi"/>
           <w:szCs w:val="24"/>
         </w:rPr>
-        <w:lastRenderedPageBreak/>
         <w:t>Se houver metas ativas</w:t>
       </w:r>
       <w:r>
@@ -4671,6 +4669,7 @@
           <w:rFonts w:asciiTheme="minorHAnsi" w:hAnsiTheme="minorHAnsi" w:cstheme="minorHAnsi"/>
           <w:szCs w:val="24"/>
         </w:rPr>
+        <w:lastRenderedPageBreak/>
         <w:t>Saída:</w:t>
       </w:r>
     </w:p>
@@ -4872,31 +4871,22 @@
           <w:b/>
           <w:szCs w:val="24"/>
         </w:rPr>
-        <w:t xml:space="preserve"> </w:t>
-      </w:r>
-      <w:r>
-        <w:rPr>
-          <w:rFonts w:asciiTheme="minorHAnsi" w:hAnsiTheme="minorHAnsi" w:cstheme="minorHAnsi"/>
-          <w:b/>
-          <w:szCs w:val="24"/>
-        </w:rPr>
-        <w:t>RF008 –  Editar Banco</w:t>
-      </w:r>
-    </w:p>
-    <w:p>
-      <w:pPr>
-        <w:jc w:val="both"/>
-        <w:rPr>
-          <w:rFonts w:asciiTheme="minorHAnsi" w:hAnsiTheme="minorHAnsi" w:cstheme="minorHAnsi"/>
-          <w:szCs w:val="24"/>
-        </w:rPr>
-      </w:pPr>
-      <w:r>
-        <w:rPr>
-          <w:rFonts w:asciiTheme="minorHAnsi" w:hAnsiTheme="minorHAnsi" w:cstheme="minorHAnsi"/>
-          <w:szCs w:val="24"/>
-        </w:rPr>
-        <w:lastRenderedPageBreak/>
+        <w:t xml:space="preserve"> RF008 –  Editar Banco</w:t>
+      </w:r>
+    </w:p>
+    <w:p>
+      <w:pPr>
+        <w:jc w:val="both"/>
+        <w:rPr>
+          <w:rFonts w:asciiTheme="minorHAnsi" w:hAnsiTheme="minorHAnsi" w:cstheme="minorHAnsi"/>
+          <w:szCs w:val="24"/>
+        </w:rPr>
+      </w:pPr>
+      <w:r>
+        <w:rPr>
+          <w:rFonts w:asciiTheme="minorHAnsi" w:hAnsiTheme="minorHAnsi" w:cstheme="minorHAnsi"/>
+          <w:szCs w:val="24"/>
+        </w:rPr>
         <w:t>Descrição: O sistema deve permitir que</w:t>
       </w:r>
       <w:r>
@@ -4964,21 +4954,7 @@
           <w:rFonts w:asciiTheme="minorHAnsi" w:hAnsiTheme="minorHAnsi" w:cstheme="minorHAnsi"/>
           <w:szCs w:val="24"/>
         </w:rPr>
-        <w:t>Identificaçã</w:t>
-      </w:r>
-      <w:r>
-        <w:rPr>
-          <w:rFonts w:asciiTheme="minorHAnsi" w:hAnsiTheme="minorHAnsi" w:cstheme="minorHAnsi"/>
-          <w:szCs w:val="24"/>
-        </w:rPr>
-        <w:t>o do banco</w:t>
-      </w:r>
-      <w:r>
-        <w:rPr>
-          <w:rFonts w:asciiTheme="minorHAnsi" w:hAnsiTheme="minorHAnsi" w:cstheme="minorHAnsi"/>
-          <w:szCs w:val="24"/>
-        </w:rPr>
-        <w:t xml:space="preserve"> (ID</w:t>
+        <w:t>Identificação do banco (ID</w:t>
       </w:r>
       <w:r>
         <w:rPr>
@@ -5006,21 +4982,7 @@
           <w:rFonts w:asciiTheme="minorHAnsi" w:hAnsiTheme="minorHAnsi" w:cstheme="minorHAnsi"/>
           <w:szCs w:val="24"/>
         </w:rPr>
-        <w:t>Identif</w:t>
-      </w:r>
-      <w:r>
-        <w:rPr>
-          <w:rFonts w:asciiTheme="minorHAnsi" w:hAnsiTheme="minorHAnsi" w:cstheme="minorHAnsi"/>
-          <w:szCs w:val="24"/>
-        </w:rPr>
-        <w:t>icação da meta</w:t>
-      </w:r>
-      <w:r>
-        <w:rPr>
-          <w:rFonts w:asciiTheme="minorHAnsi" w:hAnsiTheme="minorHAnsi" w:cstheme="minorHAnsi"/>
-          <w:szCs w:val="24"/>
-        </w:rPr>
-        <w:t xml:space="preserve"> (ID da meta</w:t>
+        <w:t>Identificação da meta (ID da meta</w:t>
       </w:r>
       <w:r>
         <w:rPr>
@@ -5069,21 +5031,7 @@
           <w:rFonts w:asciiTheme="minorHAnsi" w:hAnsiTheme="minorHAnsi" w:cstheme="minorHAnsi"/>
           <w:szCs w:val="24"/>
         </w:rPr>
-        <w:t>Nome do banco (</w:t>
-      </w:r>
-      <w:r>
-        <w:rPr>
-          <w:rFonts w:asciiTheme="minorHAnsi" w:hAnsiTheme="minorHAnsi" w:cstheme="minorHAnsi"/>
-          <w:szCs w:val="24"/>
-        </w:rPr>
-        <w:t>editável</w:t>
-      </w:r>
-      <w:r>
-        <w:rPr>
-          <w:rFonts w:asciiTheme="minorHAnsi" w:hAnsiTheme="minorHAnsi" w:cstheme="minorHAnsi"/>
-          <w:szCs w:val="24"/>
-        </w:rPr>
-        <w:t>).</w:t>
+        <w:t>Nome do banco (editável).</w:t>
       </w:r>
     </w:p>
     <w:p>
@@ -5104,21 +5052,7 @@
           <w:rFonts w:asciiTheme="minorHAnsi" w:hAnsiTheme="minorHAnsi" w:cstheme="minorHAnsi"/>
           <w:szCs w:val="24"/>
         </w:rPr>
-        <w:t>Saldo (</w:t>
-      </w:r>
-      <w:r>
-        <w:rPr>
-          <w:rFonts w:asciiTheme="minorHAnsi" w:hAnsiTheme="minorHAnsi" w:cstheme="minorHAnsi"/>
-          <w:szCs w:val="24"/>
-        </w:rPr>
-        <w:t>editável</w:t>
-      </w:r>
-      <w:r>
-        <w:rPr>
-          <w:rFonts w:asciiTheme="minorHAnsi" w:hAnsiTheme="minorHAnsi" w:cstheme="minorHAnsi"/>
-          <w:szCs w:val="24"/>
-        </w:rPr>
-        <w:t>)</w:t>
+        <w:t>Saldo (editável)</w:t>
       </w:r>
       <w:r>
         <w:rPr>
@@ -5146,21 +5080,7 @@
           <w:rFonts w:asciiTheme="minorHAnsi" w:hAnsiTheme="minorHAnsi" w:cstheme="minorHAnsi"/>
           <w:szCs w:val="24"/>
         </w:rPr>
-        <w:t>Transação (</w:t>
-      </w:r>
-      <w:r>
-        <w:rPr>
-          <w:rFonts w:asciiTheme="minorHAnsi" w:hAnsiTheme="minorHAnsi" w:cstheme="minorHAnsi"/>
-          <w:szCs w:val="24"/>
-        </w:rPr>
-        <w:t>editável</w:t>
-      </w:r>
-      <w:r>
-        <w:rPr>
-          <w:rFonts w:asciiTheme="minorHAnsi" w:hAnsiTheme="minorHAnsi" w:cstheme="minorHAnsi"/>
-          <w:szCs w:val="24"/>
-        </w:rPr>
-        <w:t>).</w:t>
+        <w:t>Transação (editável).</w:t>
       </w:r>
     </w:p>
     <w:p>
@@ -5181,21 +5101,7 @@
           <w:rFonts w:asciiTheme="minorHAnsi" w:hAnsiTheme="minorHAnsi" w:cstheme="minorHAnsi"/>
           <w:szCs w:val="24"/>
         </w:rPr>
-        <w:t>Despesa (</w:t>
-      </w:r>
-      <w:r>
-        <w:rPr>
-          <w:rFonts w:asciiTheme="minorHAnsi" w:hAnsiTheme="minorHAnsi" w:cstheme="minorHAnsi"/>
-          <w:szCs w:val="24"/>
-        </w:rPr>
-        <w:t>editável</w:t>
-      </w:r>
-      <w:r>
-        <w:rPr>
-          <w:rFonts w:asciiTheme="minorHAnsi" w:hAnsiTheme="minorHAnsi" w:cstheme="minorHAnsi"/>
-          <w:szCs w:val="24"/>
-        </w:rPr>
-        <w:t>).</w:t>
+        <w:t>Despesa (editável).</w:t>
       </w:r>
     </w:p>
     <w:p>
@@ -5508,6 +5414,7 @@
           <w:rFonts w:asciiTheme="minorHAnsi" w:hAnsiTheme="minorHAnsi" w:cstheme="minorHAnsi"/>
           <w:szCs w:val="24"/>
         </w:rPr>
+        <w:lastRenderedPageBreak/>
         <w:t>Prioridade: Alta</w:t>
       </w:r>
     </w:p>
@@ -5717,7 +5624,6 @@
           <w:rFonts w:asciiTheme="minorHAnsi" w:hAnsiTheme="minorHAnsi" w:cstheme="minorHAnsi"/>
           <w:szCs w:val="24"/>
         </w:rPr>
-        <w:lastRenderedPageBreak/>
         <w:t>Mensagem de erro ao gerar o extrato, se houver algum erro relacionado a geração do gráfico</w:t>
       </w:r>
     </w:p>
@@ -5997,7 +5903,7 @@
 
 <file path=word/comments.xml><?xml version="1.0" encoding="utf-8"?>
 <w:comments xmlns:wpc="http://schemas.microsoft.com/office/word/2010/wordprocessingCanvas" xmlns:cx="http://schemas.microsoft.com/office/drawing/2014/chartex" xmlns:mc="http://schemas.openxmlformats.org/markup-compatibility/2006" xmlns:o="urn:schemas-microsoft-com:office:office" xmlns:r="http://schemas.openxmlformats.org/officeDocument/2006/relationships" xmlns:m="http://schemas.openxmlformats.org/officeDocument/2006/math" xmlns:v="urn:schemas-microsoft-com:vml" xmlns:wp14="http://schemas.microsoft.com/office/word/2010/wordprocessingDrawing" xmlns:wp="http://schemas.openxmlformats.org/drawingml/2006/wordprocessingDrawing" xmlns:w10="urn:schemas-microsoft-com:office:word" xmlns:w="http://schemas.openxmlformats.org/wordprocessingml/2006/main" xmlns:w14="http://schemas.microsoft.com/office/word/2010/wordml" xmlns:w15="http://schemas.microsoft.com/office/word/2012/wordml" xmlns:w16se="http://schemas.microsoft.com/office/word/2015/wordml/symex" xmlns:wpg="http://schemas.microsoft.com/office/word/2010/wordprocessingGroup" xmlns:wpi="http://schemas.microsoft.com/office/word/2010/wordprocessingInk" xmlns:wne="http://schemas.microsoft.com/office/word/2006/wordml" xmlns:wps="http://schemas.microsoft.com/office/word/2010/wordprocessingShape" mc:Ignorable="w14 w15 w16se wp14">
-  <w:comment w:id="0" w:author="Yuri Dinato" w:date="2025-02-28T16:12:00Z" w:initials="YD">
+  <w:comment w:id="1" w:author="Yuri Dinato" w:date="2025-02-28T16:12:00Z" w:initials="YD">
     <w:p>
       <w:pPr>
         <w:pStyle w:val="Textodecomentrio"/>
@@ -11542,6 +11448,7 @@
   <w:style w:type="character" w:default="1" w:styleId="Fontepargpadro">
     <w:name w:val="Default Paragraph Font"/>
     <w:uiPriority w:val="1"/>
+    <w:semiHidden/>
     <w:unhideWhenUsed/>
   </w:style>
   <w:style w:type="table" w:default="1" w:styleId="Tabelanormal">
@@ -12085,7 +11992,7 @@
 </file>
 
 <file path=customXml/itemProps1.xml><?xml version="1.0" encoding="utf-8"?>
-<ds:datastoreItem xmlns:ds="http://schemas.openxmlformats.org/officeDocument/2006/customXml" ds:itemID="{D3ECF329-1EB7-4FE0-90CE-B6D33936AFE1}">
+<ds:datastoreItem xmlns:ds="http://schemas.openxmlformats.org/officeDocument/2006/customXml" ds:itemID="{3AA2D39B-B250-4160-9303-6727F99D6AB4}">
   <ds:schemaRefs>
     <ds:schemaRef ds:uri="http://schemas.openxmlformats.org/officeDocument/2006/bibliography"/>
   </ds:schemaRefs>

</xml_diff>

<commit_message>
Terminado paragrafo do requistos funcionais
</commit_message>
<xml_diff>
--- a/docs/sistemas de gestão de finanças pessoais com metas - FINANÇAFACIL.docx
+++ b/docs/sistemas de gestão de finanças pessoais com metas - FINANÇAFACIL.docx
@@ -1350,12 +1350,14 @@
         <w:jc w:val="both"/>
         <w:rPr>
           <w:rFonts w:asciiTheme="minorHAnsi" w:hAnsiTheme="minorHAnsi" w:cstheme="minorHAnsi"/>
-          <w:szCs w:val="24"/>
-        </w:rPr>
-      </w:pPr>
-      <w:r>
-        <w:rPr>
-          <w:rFonts w:asciiTheme="minorHAnsi" w:hAnsiTheme="minorHAnsi" w:cstheme="minorHAnsi"/>
+          <w:b/>
+          <w:szCs w:val="24"/>
+        </w:rPr>
+      </w:pPr>
+      <w:r>
+        <w:rPr>
+          <w:rFonts w:asciiTheme="minorHAnsi" w:hAnsiTheme="minorHAnsi" w:cstheme="minorHAnsi"/>
+          <w:b/>
           <w:szCs w:val="24"/>
         </w:rPr>
         <w:t>2.</w:t>
@@ -1363,6 +1365,7 @@
       <w:r>
         <w:rPr>
           <w:rFonts w:asciiTheme="minorHAnsi" w:hAnsiTheme="minorHAnsi" w:cstheme="minorHAnsi"/>
+          <w:b/>
           <w:szCs w:val="24"/>
         </w:rPr>
         <w:t>1</w:t>
@@ -1370,6 +1373,7 @@
       <w:r>
         <w:rPr>
           <w:rFonts w:asciiTheme="minorHAnsi" w:hAnsiTheme="minorHAnsi" w:cstheme="minorHAnsi"/>
+          <w:b/>
           <w:szCs w:val="24"/>
         </w:rPr>
         <w:t xml:space="preserve"> Requisitos funcionais</w:t>
@@ -1388,29 +1392,54 @@
           <w:rFonts w:asciiTheme="minorHAnsi" w:hAnsiTheme="minorHAnsi" w:cstheme="minorHAnsi"/>
           <w:szCs w:val="24"/>
         </w:rPr>
-        <w:t>Descrever sobre o que é os requisitos funcionais (dissertar, nada de pergunta e resposta)</w:t>
-      </w:r>
-    </w:p>
-    <w:p>
-      <w:pPr>
-        <w:jc w:val="both"/>
-        <w:rPr>
-          <w:rFonts w:asciiTheme="minorHAnsi" w:hAnsiTheme="minorHAnsi" w:cstheme="minorHAnsi"/>
-          <w:szCs w:val="24"/>
-        </w:rPr>
-      </w:pPr>
-    </w:p>
-    <w:p>
-      <w:pPr>
-        <w:jc w:val="both"/>
-        <w:rPr>
-          <w:rFonts w:asciiTheme="minorHAnsi" w:hAnsiTheme="minorHAnsi" w:cstheme="minorHAnsi"/>
-          <w:szCs w:val="24"/>
-        </w:rPr>
-      </w:pPr>
-      <w:r>
-        <w:rPr>
-          <w:rFonts w:asciiTheme="minorHAnsi" w:hAnsiTheme="minorHAnsi" w:cstheme="minorHAnsi"/>
+        <w:t>Para garantir o funcionamento eficiente do sistema, suas funcionalidades devem ser claramente definidas. Os requisitos funcionais descrevem as operações essenciais, como controle de receitas e despesas, geração de relatórios e gestão de contas, determinando como o sistema deve responder a diferentes entradas. Um bom detalhamento desses requisitos assegura que o sistema atenda às necessidades dos usuários e funcione cor</w:t>
+      </w:r>
+      <w:r>
+        <w:rPr>
+          <w:rFonts w:asciiTheme="minorHAnsi" w:hAnsiTheme="minorHAnsi" w:cstheme="minorHAnsi"/>
+          <w:szCs w:val="24"/>
+        </w:rPr>
+        <w:t>retamente em diversos cenários.</w:t>
+      </w:r>
+    </w:p>
+    <w:p>
+      <w:pPr>
+        <w:jc w:val="both"/>
+        <w:rPr>
+          <w:rFonts w:asciiTheme="minorHAnsi" w:hAnsiTheme="minorHAnsi" w:cstheme="minorHAnsi"/>
+          <w:szCs w:val="24"/>
+        </w:rPr>
+      </w:pPr>
+      <w:r>
+        <w:rPr>
+          <w:rFonts w:asciiTheme="minorHAnsi" w:hAnsiTheme="minorHAnsi" w:cstheme="minorHAnsi"/>
+          <w:szCs w:val="24"/>
+        </w:rPr>
+        <w:t>A seguir, a Tabela 1 apresenta a descrição dos requisitos funcionais do sistema de gerenciamento financeiro.</w:t>
+      </w:r>
+    </w:p>
+    <w:p>
+      <w:pPr>
+        <w:jc w:val="both"/>
+        <w:rPr>
+          <w:rFonts w:asciiTheme="minorHAnsi" w:hAnsiTheme="minorHAnsi" w:cstheme="minorHAnsi"/>
+          <w:szCs w:val="24"/>
+        </w:rPr>
+      </w:pPr>
+    </w:p>
+    <w:p>
+      <w:pPr>
+        <w:jc w:val="both"/>
+        <w:rPr>
+          <w:rFonts w:asciiTheme="minorHAnsi" w:hAnsiTheme="minorHAnsi" w:cstheme="minorHAnsi"/>
+          <w:b/>
+          <w:szCs w:val="24"/>
+        </w:rPr>
+      </w:pPr>
+      <w:r>
+        <w:rPr>
+          <w:rFonts w:asciiTheme="minorHAnsi" w:hAnsiTheme="minorHAnsi" w:cstheme="minorHAnsi"/>
+          <w:b/>
           <w:szCs w:val="24"/>
         </w:rPr>
         <w:t>2.2 Requisitos não funcionais</w:t>
@@ -1430,17 +1459,44 @@
         </w:rPr>
         <w:t>A transformação precisa acontecer quase que de imediato, de maneira ágil e eficaz. Para garantir que os números mostrados sejam exatos, a ferramenta deve buscar dados em plataformas de câmbio sempre revisadas e de reputação sólida, prevenindo erros nos cálculos. Adicionalmente, a página precisa ser simples de usar, facilitando a escolha das moedas que serão convertidas, sem gerar confusão. O uso deve ser leve e direto, sem passos extras, fazendo com que qualquer pessoa consiga usar sem problemas. Para finalizar, o valor final da conversão deve ser exibido de forma organizada, nítida e fácil de entender, assegurando que o usuário compreenda o resultado na hora, sem precisar pensar muito.</w:t>
       </w:r>
+    </w:p>
+    <w:p>
+      <w:pPr>
+        <w:jc w:val="both"/>
+        <w:rPr>
+          <w:rFonts w:asciiTheme="minorHAnsi" w:hAnsiTheme="minorHAnsi" w:cstheme="minorHAnsi"/>
+          <w:szCs w:val="24"/>
+        </w:rPr>
+      </w:pPr>
+    </w:p>
+    <w:p>
+      <w:pPr>
+        <w:jc w:val="both"/>
+        <w:rPr>
+          <w:rFonts w:asciiTheme="minorHAnsi" w:hAnsiTheme="minorHAnsi" w:cstheme="minorHAnsi"/>
+          <w:szCs w:val="24"/>
+        </w:rPr>
+      </w:pPr>
+    </w:p>
+    <w:p>
+      <w:pPr>
+        <w:jc w:val="both"/>
+        <w:rPr>
+          <w:rFonts w:asciiTheme="minorHAnsi" w:hAnsiTheme="minorHAnsi" w:cstheme="minorHAnsi"/>
+          <w:szCs w:val="24"/>
+        </w:rPr>
+      </w:pPr>
+    </w:p>
+    <w:p>
+      <w:pPr>
+        <w:jc w:val="both"/>
+        <w:rPr>
+          <w:rFonts w:asciiTheme="minorHAnsi" w:hAnsiTheme="minorHAnsi" w:cstheme="minorHAnsi"/>
+          <w:szCs w:val="24"/>
+        </w:rPr>
+      </w:pPr>
       <w:bookmarkStart w:id="0" w:name="_GoBack"/>
       <w:bookmarkEnd w:id="0"/>
-    </w:p>
-    <w:p>
-      <w:pPr>
-        <w:jc w:val="both"/>
-        <w:rPr>
-          <w:rFonts w:asciiTheme="minorHAnsi" w:hAnsiTheme="minorHAnsi" w:cstheme="minorHAnsi"/>
-          <w:szCs w:val="24"/>
-        </w:rPr>
-      </w:pPr>
     </w:p>
     <w:p>
       <w:pPr>
@@ -1937,7 +1993,6 @@
                 <w:rFonts w:asciiTheme="minorHAnsi" w:hAnsiTheme="minorHAnsi" w:cstheme="minorHAnsi"/>
                 <w:szCs w:val="24"/>
               </w:rPr>
-              <w:lastRenderedPageBreak/>
               <w:t>RF009</w:t>
             </w:r>
           </w:p>
@@ -2478,6 +2533,7 @@
           <w:rFonts w:asciiTheme="minorHAnsi" w:hAnsiTheme="minorHAnsi" w:cstheme="minorHAnsi"/>
           <w:szCs w:val="24"/>
         </w:rPr>
+        <w:lastRenderedPageBreak/>
         <w:t xml:space="preserve">Descrição: </w:t>
       </w:r>
       <w:r>
@@ -2680,7 +2736,6 @@
           <w:rFonts w:asciiTheme="minorHAnsi" w:hAnsiTheme="minorHAnsi" w:cstheme="minorHAnsi"/>
           <w:szCs w:val="24"/>
         </w:rPr>
-        <w:lastRenderedPageBreak/>
         <w:t>Processamento:</w:t>
       </w:r>
     </w:p>
@@ -3055,6 +3110,7 @@
           <w:rFonts w:asciiTheme="minorHAnsi" w:hAnsiTheme="minorHAnsi" w:cstheme="minorHAnsi"/>
           <w:szCs w:val="24"/>
         </w:rPr>
+        <w:lastRenderedPageBreak/>
         <w:t>Aviso de alerta ao tentar excluir a conta se possuir metas associadas ao cliente.</w:t>
       </w:r>
     </w:p>
@@ -3205,7 +3261,6 @@
         <w:jc w:val="both"/>
       </w:pPr>
       <w:r>
-        <w:lastRenderedPageBreak/>
         <w:t>Nome da meta</w:t>
       </w:r>
       <w:r>
@@ -3651,6 +3706,7 @@
           <w:rFonts w:asciiTheme="minorHAnsi" w:hAnsiTheme="minorHAnsi" w:cstheme="minorHAnsi"/>
           <w:szCs w:val="24"/>
         </w:rPr>
+        <w:lastRenderedPageBreak/>
         <w:t>D</w:t>
       </w:r>
       <w:r>
@@ -3886,7 +3942,6 @@
           <w:rFonts w:asciiTheme="minorHAnsi" w:hAnsiTheme="minorHAnsi" w:cstheme="minorHAnsi"/>
           <w:szCs w:val="24"/>
         </w:rPr>
-        <w:lastRenderedPageBreak/>
         <w:t>Pós-condição:</w:t>
       </w:r>
     </w:p>
@@ -4392,6 +4447,7 @@
           <w:rFonts w:asciiTheme="minorHAnsi" w:hAnsiTheme="minorHAnsi" w:cstheme="minorHAnsi"/>
           <w:szCs w:val="24"/>
         </w:rPr>
+        <w:lastRenderedPageBreak/>
         <w:t>Entrada:</w:t>
       </w:r>
     </w:p>
@@ -4669,7 +4725,6 @@
           <w:rFonts w:asciiTheme="minorHAnsi" w:hAnsiTheme="minorHAnsi" w:cstheme="minorHAnsi"/>
           <w:szCs w:val="24"/>
         </w:rPr>
-        <w:lastRenderedPageBreak/>
         <w:t>Saída:</w:t>
       </w:r>
     </w:p>
@@ -5173,6 +5228,7 @@
           <w:rFonts w:asciiTheme="minorHAnsi" w:hAnsiTheme="minorHAnsi" w:cstheme="minorHAnsi"/>
           <w:szCs w:val="24"/>
         </w:rPr>
+        <w:lastRenderedPageBreak/>
         <w:t>O</w:t>
       </w:r>
       <w:r>
@@ -5414,7 +5470,6 @@
           <w:rFonts w:asciiTheme="minorHAnsi" w:hAnsiTheme="minorHAnsi" w:cstheme="minorHAnsi"/>
           <w:szCs w:val="24"/>
         </w:rPr>
-        <w:lastRenderedPageBreak/>
         <w:t>Prioridade: Alta</w:t>
       </w:r>
     </w:p>
@@ -11992,7 +12047,7 @@
 </file>
 
 <file path=customXml/itemProps1.xml><?xml version="1.0" encoding="utf-8"?>
-<ds:datastoreItem xmlns:ds="http://schemas.openxmlformats.org/officeDocument/2006/customXml" ds:itemID="{3AA2D39B-B250-4160-9303-6727F99D6AB4}">
+<ds:datastoreItem xmlns:ds="http://schemas.openxmlformats.org/officeDocument/2006/customXml" ds:itemID="{A9C8694B-01AA-4315-8080-E42854871F95}">
   <ds:schemaRefs>
     <ds:schemaRef ds:uri="http://schemas.openxmlformats.org/officeDocument/2006/bibliography"/>
   </ds:schemaRefs>

</xml_diff>

<commit_message>
Mudando para unique no email da entidade cliente
</commit_message>
<xml_diff>
--- a/docs/sistemas de gestão de finanças pessoais com metas - FINANÇAFACIL.docx
+++ b/docs/sistemas de gestão de finanças pessoais com metas - FINANÇAFACIL.docx
@@ -1495,8 +1495,6 @@
           <w:szCs w:val="24"/>
         </w:rPr>
       </w:pPr>
-      <w:bookmarkStart w:id="0" w:name="_GoBack"/>
-      <w:bookmarkEnd w:id="0"/>
     </w:p>
     <w:p>
       <w:pPr>
@@ -1951,22 +1949,7 @@
                 <w:rFonts w:asciiTheme="minorHAnsi" w:hAnsiTheme="minorHAnsi" w:cstheme="minorHAnsi"/>
                 <w:szCs w:val="24"/>
               </w:rPr>
-              <w:t xml:space="preserve">Editar </w:t>
-            </w:r>
-            <w:commentRangeStart w:id="1"/>
-            <w:r>
-              <w:rPr>
-                <w:rFonts w:asciiTheme="minorHAnsi" w:hAnsiTheme="minorHAnsi" w:cstheme="minorHAnsi"/>
-                <w:szCs w:val="24"/>
-              </w:rPr>
-              <w:t>Banco</w:t>
-            </w:r>
-            <w:commentRangeEnd w:id="1"/>
-            <w:r>
-              <w:rPr>
-                <w:rStyle w:val="Refdecomentrio"/>
-              </w:rPr>
-              <w:commentReference w:id="1"/>
+              <w:t>Editar Banco</w:t>
             </w:r>
           </w:p>
         </w:tc>
@@ -2027,7 +2010,6 @@
         <w:pStyle w:val="Legenda"/>
         <w:jc w:val="center"/>
         <w:rPr>
-          <w:rFonts w:asciiTheme="minorHAnsi" w:hAnsiTheme="minorHAnsi" w:cstheme="minorHAnsi"/>
           <w:sz w:val="20"/>
           <w:szCs w:val="20"/>
         </w:rPr>
@@ -2081,6 +2063,128 @@
           <w:szCs w:val="20"/>
         </w:rPr>
         <w:t xml:space="preserve"> - Requisitos Funcionais</w:t>
+      </w:r>
+      <w:bookmarkStart w:id="0" w:name="_GoBack"/>
+      <w:bookmarkEnd w:id="0"/>
+    </w:p>
+    <w:tbl>
+      <w:tblPr>
+        <w:tblStyle w:val="Tabelacomgrade"/>
+        <w:tblW w:w="0" w:type="auto"/>
+        <w:jc w:val="center"/>
+        <w:tblLook w:val="04A0" w:firstRow="1" w:lastRow="0" w:firstColumn="1" w:lastColumn="0" w:noHBand="0" w:noVBand="1"/>
+      </w:tblPr>
+      <w:tblGrid>
+        <w:gridCol w:w="3020"/>
+        <w:gridCol w:w="3020"/>
+      </w:tblGrid>
+      <w:tr>
+        <w:trPr>
+          <w:jc w:val="center"/>
+        </w:trPr>
+        <w:tc>
+          <w:tcPr>
+            <w:tcW w:w="6040" w:type="dxa"/>
+            <w:gridSpan w:val="2"/>
+          </w:tcPr>
+          <w:p>
+            <w:pPr>
+              <w:ind w:firstLine="0"/>
+              <w:jc w:val="center"/>
+              <w:rPr>
+                <w:rFonts w:asciiTheme="minorHAnsi" w:hAnsiTheme="minorHAnsi" w:cstheme="minorHAnsi"/>
+                <w:szCs w:val="24"/>
+              </w:rPr>
+            </w:pPr>
+            <w:r>
+              <w:rPr>
+                <w:rFonts w:asciiTheme="minorHAnsi" w:hAnsiTheme="minorHAnsi" w:cstheme="minorHAnsi"/>
+                <w:szCs w:val="24"/>
+              </w:rPr>
+              <w:t>Requisito</w:t>
+            </w:r>
+            <w:r>
+              <w:rPr>
+                <w:rFonts w:asciiTheme="minorHAnsi" w:hAnsiTheme="minorHAnsi" w:cstheme="minorHAnsi"/>
+                <w:szCs w:val="24"/>
+              </w:rPr>
+              <w:t xml:space="preserve"> Não</w:t>
+            </w:r>
+            <w:r>
+              <w:rPr>
+                <w:rFonts w:asciiTheme="minorHAnsi" w:hAnsiTheme="minorHAnsi" w:cstheme="minorHAnsi"/>
+                <w:szCs w:val="24"/>
+              </w:rPr>
+              <w:t xml:space="preserve"> Funcional</w:t>
+            </w:r>
+          </w:p>
+        </w:tc>
+      </w:tr>
+      <w:tr>
+        <w:trPr>
+          <w:jc w:val="center"/>
+        </w:trPr>
+        <w:tc>
+          <w:tcPr>
+            <w:tcW w:w="3020" w:type="dxa"/>
+          </w:tcPr>
+          <w:p>
+            <w:pPr>
+              <w:ind w:firstLine="0"/>
+              <w:jc w:val="both"/>
+              <w:rPr>
+                <w:rFonts w:asciiTheme="minorHAnsi" w:hAnsiTheme="minorHAnsi" w:cstheme="minorHAnsi"/>
+                <w:szCs w:val="24"/>
+              </w:rPr>
+            </w:pPr>
+            <w:r>
+              <w:rPr>
+                <w:rFonts w:asciiTheme="minorHAnsi" w:hAnsiTheme="minorHAnsi" w:cstheme="minorHAnsi"/>
+                <w:szCs w:val="24"/>
+              </w:rPr>
+              <w:t>RF001</w:t>
+            </w:r>
+            <w:r>
+              <w:rPr>
+                <w:rFonts w:asciiTheme="minorHAnsi" w:hAnsiTheme="minorHAnsi" w:cstheme="minorHAnsi"/>
+                <w:szCs w:val="24"/>
+              </w:rPr>
+              <w:t>0</w:t>
+            </w:r>
+          </w:p>
+        </w:tc>
+        <w:tc>
+          <w:tcPr>
+            <w:tcW w:w="3020" w:type="dxa"/>
+          </w:tcPr>
+          <w:p>
+            <w:pPr>
+              <w:keepNext/>
+              <w:ind w:firstLine="0"/>
+              <w:jc w:val="both"/>
+              <w:rPr>
+                <w:rFonts w:asciiTheme="minorHAnsi" w:hAnsiTheme="minorHAnsi" w:cstheme="minorHAnsi"/>
+                <w:szCs w:val="24"/>
+              </w:rPr>
+            </w:pPr>
+            <w:r>
+              <w:rPr>
+                <w:rFonts w:asciiTheme="minorHAnsi" w:hAnsiTheme="minorHAnsi" w:cstheme="minorHAnsi"/>
+                <w:szCs w:val="24"/>
+              </w:rPr>
+              <w:t>Conversor de moeda</w:t>
+            </w:r>
+          </w:p>
+        </w:tc>
+      </w:tr>
+    </w:tbl>
+    <w:p>
+      <w:pPr>
+        <w:pStyle w:val="Legenda"/>
+        <w:jc w:val="center"/>
+      </w:pPr>
+      <w:r>
+        <w:t>Tabela 2 – Requisito Não Funcional</w:t>
       </w:r>
     </w:p>
     <w:p>
@@ -2453,6 +2557,7 @@
           <w:rFonts w:asciiTheme="minorHAnsi" w:hAnsiTheme="minorHAnsi" w:cstheme="minorHAnsi"/>
           <w:szCs w:val="24"/>
         </w:rPr>
+        <w:lastRenderedPageBreak/>
         <w:t>O cliente cadastrado</w:t>
       </w:r>
       <w:r>
@@ -2533,7 +2638,6 @@
           <w:rFonts w:asciiTheme="minorHAnsi" w:hAnsiTheme="minorHAnsi" w:cstheme="minorHAnsi"/>
           <w:szCs w:val="24"/>
         </w:rPr>
-        <w:lastRenderedPageBreak/>
         <w:t xml:space="preserve">Descrição: </w:t>
       </w:r>
       <w:r>
@@ -3045,6 +3149,7 @@
           <w:rFonts w:asciiTheme="minorHAnsi" w:hAnsiTheme="minorHAnsi" w:cstheme="minorHAnsi"/>
           <w:szCs w:val="24"/>
         </w:rPr>
+        <w:lastRenderedPageBreak/>
         <w:t xml:space="preserve">Se houver metas </w:t>
       </w:r>
       <w:r>
@@ -3110,7 +3215,6 @@
           <w:rFonts w:asciiTheme="minorHAnsi" w:hAnsiTheme="minorHAnsi" w:cstheme="minorHAnsi"/>
           <w:szCs w:val="24"/>
         </w:rPr>
-        <w:lastRenderedPageBreak/>
         <w:t>Aviso de alerta ao tentar excluir a conta se possuir metas associadas ao cliente.</w:t>
       </w:r>
     </w:p>
@@ -3576,6 +3680,7 @@
           <w:rFonts w:asciiTheme="minorHAnsi" w:hAnsiTheme="minorHAnsi" w:cstheme="minorHAnsi"/>
           <w:szCs w:val="24"/>
         </w:rPr>
+        <w:lastRenderedPageBreak/>
         <w:t>Descrição: O sistema deve permitir que o usuário edite as informações de um</w:t>
       </w:r>
       <w:r>
@@ -3706,7 +3811,6 @@
           <w:rFonts w:asciiTheme="minorHAnsi" w:hAnsiTheme="minorHAnsi" w:cstheme="minorHAnsi"/>
           <w:szCs w:val="24"/>
         </w:rPr>
-        <w:lastRenderedPageBreak/>
         <w:t>D</w:t>
       </w:r>
       <w:r>
@@ -4326,6 +4430,7 @@
           <w:rFonts w:asciiTheme="minorHAnsi" w:hAnsiTheme="minorHAnsi" w:cstheme="minorHAnsi"/>
           <w:szCs w:val="24"/>
         </w:rPr>
+        <w:lastRenderedPageBreak/>
         <w:t>A</w:t>
       </w:r>
       <w:r>
@@ -4447,7 +4552,6 @@
           <w:rFonts w:asciiTheme="minorHAnsi" w:hAnsiTheme="minorHAnsi" w:cstheme="minorHAnsi"/>
           <w:szCs w:val="24"/>
         </w:rPr>
-        <w:lastRenderedPageBreak/>
         <w:t>Entrada:</w:t>
       </w:r>
     </w:p>
@@ -5086,6 +5190,7 @@
           <w:rFonts w:asciiTheme="minorHAnsi" w:hAnsiTheme="minorHAnsi" w:cstheme="minorHAnsi"/>
           <w:szCs w:val="24"/>
         </w:rPr>
+        <w:lastRenderedPageBreak/>
         <w:t>Nome do banco (editável).</w:t>
       </w:r>
     </w:p>
@@ -5228,7 +5333,6 @@
           <w:rFonts w:asciiTheme="minorHAnsi" w:hAnsiTheme="minorHAnsi" w:cstheme="minorHAnsi"/>
           <w:szCs w:val="24"/>
         </w:rPr>
-        <w:lastRenderedPageBreak/>
         <w:t>O</w:t>
       </w:r>
       <w:r>
@@ -5954,30 +6058,6 @@
     </w:sectPr>
   </w:body>
 </w:document>
-</file>
-
-<file path=word/comments.xml><?xml version="1.0" encoding="utf-8"?>
-<w:comments xmlns:wpc="http://schemas.microsoft.com/office/word/2010/wordprocessingCanvas" xmlns:cx="http://schemas.microsoft.com/office/drawing/2014/chartex" xmlns:mc="http://schemas.openxmlformats.org/markup-compatibility/2006" xmlns:o="urn:schemas-microsoft-com:office:office" xmlns:r="http://schemas.openxmlformats.org/officeDocument/2006/relationships" xmlns:m="http://schemas.openxmlformats.org/officeDocument/2006/math" xmlns:v="urn:schemas-microsoft-com:vml" xmlns:wp14="http://schemas.microsoft.com/office/word/2010/wordprocessingDrawing" xmlns:wp="http://schemas.openxmlformats.org/drawingml/2006/wordprocessingDrawing" xmlns:w10="urn:schemas-microsoft-com:office:word" xmlns:w="http://schemas.openxmlformats.org/wordprocessingml/2006/main" xmlns:w14="http://schemas.microsoft.com/office/word/2010/wordml" xmlns:w15="http://schemas.microsoft.com/office/word/2012/wordml" xmlns:w16se="http://schemas.microsoft.com/office/word/2015/wordml/symex" xmlns:wpg="http://schemas.microsoft.com/office/word/2010/wordprocessingGroup" xmlns:wpi="http://schemas.microsoft.com/office/word/2010/wordprocessingInk" xmlns:wne="http://schemas.microsoft.com/office/word/2006/wordml" xmlns:wps="http://schemas.microsoft.com/office/word/2010/wordprocessingShape" mc:Ignorable="w14 w15 w16se wp14">
-  <w:comment w:id="1" w:author="Yuri Dinato" w:date="2025-02-28T16:12:00Z" w:initials="YD">
-    <w:p>
-      <w:pPr>
-        <w:pStyle w:val="Textodecomentrio"/>
-      </w:pPr>
-      <w:r>
-        <w:rPr>
-          <w:rStyle w:val="Refdecomentrio"/>
-        </w:rPr>
-        <w:annotationRef/>
-      </w:r>
-    </w:p>
-  </w:comment>
-</w:comments>
-</file>
-
-<file path=word/commentsExtended.xml><?xml version="1.0" encoding="utf-8"?>
-<w15:commentsEx xmlns:wpc="http://schemas.microsoft.com/office/word/2010/wordprocessingCanvas" xmlns:cx="http://schemas.microsoft.com/office/drawing/2014/chartex" xmlns:mc="http://schemas.openxmlformats.org/markup-compatibility/2006" xmlns:o="urn:schemas-microsoft-com:office:office" xmlns:r="http://schemas.openxmlformats.org/officeDocument/2006/relationships" xmlns:m="http://schemas.openxmlformats.org/officeDocument/2006/math" xmlns:v="urn:schemas-microsoft-com:vml" xmlns:wp14="http://schemas.microsoft.com/office/word/2010/wordprocessingDrawing" xmlns:wp="http://schemas.openxmlformats.org/drawingml/2006/wordprocessingDrawing" xmlns:w10="urn:schemas-microsoft-com:office:word" xmlns:w="http://schemas.openxmlformats.org/wordprocessingml/2006/main" xmlns:w14="http://schemas.microsoft.com/office/word/2010/wordml" xmlns:w15="http://schemas.microsoft.com/office/word/2012/wordml" xmlns:w16se="http://schemas.microsoft.com/office/word/2015/wordml/symex" xmlns:wpg="http://schemas.microsoft.com/office/word/2010/wordprocessingGroup" xmlns:wpi="http://schemas.microsoft.com/office/word/2010/wordprocessingInk" xmlns:wne="http://schemas.microsoft.com/office/word/2006/wordml" xmlns:wps="http://schemas.microsoft.com/office/word/2010/wordprocessingShape" mc:Ignorable="w14 w15 w16se wp14">
-  <w15:commentEx w15:paraId="174539FA" w15:done="0"/>
-</w15:commentsEx>
 </file>
 
 <file path=word/endnotes.xml><?xml version="1.0" encoding="utf-8"?>
@@ -11021,14 +11101,6 @@
     <w:abstractNumId w:val="19"/>
   </w:num>
 </w:numbering>
-</file>
-
-<file path=word/people.xml><?xml version="1.0" encoding="utf-8"?>
-<w15:people xmlns:wpc="http://schemas.microsoft.com/office/word/2010/wordprocessingCanvas" xmlns:cx="http://schemas.microsoft.com/office/drawing/2014/chartex" xmlns:mc="http://schemas.openxmlformats.org/markup-compatibility/2006" xmlns:o="urn:schemas-microsoft-com:office:office" xmlns:r="http://schemas.openxmlformats.org/officeDocument/2006/relationships" xmlns:m="http://schemas.openxmlformats.org/officeDocument/2006/math" xmlns:v="urn:schemas-microsoft-com:vml" xmlns:wp14="http://schemas.microsoft.com/office/word/2010/wordprocessingDrawing" xmlns:wp="http://schemas.openxmlformats.org/drawingml/2006/wordprocessingDrawing" xmlns:w10="urn:schemas-microsoft-com:office:word" xmlns:w="http://schemas.openxmlformats.org/wordprocessingml/2006/main" xmlns:w14="http://schemas.microsoft.com/office/word/2010/wordml" xmlns:w15="http://schemas.microsoft.com/office/word/2012/wordml" xmlns:w16se="http://schemas.microsoft.com/office/word/2015/wordml/symex" xmlns:wpg="http://schemas.microsoft.com/office/word/2010/wordprocessingGroup" xmlns:wpi="http://schemas.microsoft.com/office/word/2010/wordprocessingInk" xmlns:wne="http://schemas.microsoft.com/office/word/2006/wordml" xmlns:wps="http://schemas.microsoft.com/office/word/2010/wordprocessingShape" mc:Ignorable="w14 w15 w16se wp14">
-  <w15:person w15:author="Yuri Dinato">
-    <w15:presenceInfo w15:providerId="None" w15:userId="Yuri Dinato"/>
-  </w15:person>
-</w15:people>
 </file>
 
 <file path=word/styles.xml><?xml version="1.0" encoding="utf-8"?>
@@ -12047,7 +12119,7 @@
 </file>
 
 <file path=customXml/itemProps1.xml><?xml version="1.0" encoding="utf-8"?>
-<ds:datastoreItem xmlns:ds="http://schemas.openxmlformats.org/officeDocument/2006/customXml" ds:itemID="{A9C8694B-01AA-4315-8080-E42854871F95}">
+<ds:datastoreItem xmlns:ds="http://schemas.openxmlformats.org/officeDocument/2006/customXml" ds:itemID="{ACE4B0C9-5D86-4BE0-A3B5-9CA88649C479}">
   <ds:schemaRefs>
     <ds:schemaRef ds:uri="http://schemas.openxmlformats.org/officeDocument/2006/bibliography"/>
   </ds:schemaRefs>

</xml_diff>

<commit_message>
Benchmark na documentação feito
</commit_message>
<xml_diff>
--- a/docs/sistemas de gestão de finanças pessoais com metas - FINANÇAFACIL.docx
+++ b/docs/sistemas de gestão de finanças pessoais com metas - FINANÇAFACIL.docx
@@ -1226,6 +1226,243 @@
     <w:p>
       <w:pPr>
         <w:pStyle w:val="PargrafodaLista"/>
+        <w:ind w:left="400" w:firstLine="308"/>
+        <w:jc w:val="both"/>
+        <w:rPr>
+          <w:rFonts w:asciiTheme="minorHAnsi" w:hAnsiTheme="minorHAnsi" w:cstheme="minorHAnsi"/>
+          <w:szCs w:val="24"/>
+          <w:bdr w:val="none" w:sz="0" w:space="0" w:color="auto" w:frame="1"/>
+        </w:rPr>
+      </w:pPr>
+      <w:r>
+        <w:rPr>
+          <w:rFonts w:asciiTheme="minorHAnsi" w:hAnsiTheme="minorHAnsi" w:cstheme="minorHAnsi"/>
+          <w:noProof/>
+          <w:szCs w:val="24"/>
+          <w:bdr w:val="none" w:sz="0" w:space="0" w:color="auto" w:frame="1"/>
+          <w:lang w:eastAsia="pt-BR"/>
+        </w:rPr>
+        <w:drawing>
+          <wp:inline distT="0" distB="0" distL="0" distR="0" wp14:anchorId="23118E27" wp14:editId="781C5E8D">
+            <wp:extent cx="5760085" cy="2650490"/>
+            <wp:effectExtent l="0" t="0" r="0" b="0"/>
+            <wp:docPr id="2" name="Imagem 2"/>
+            <wp:cNvGraphicFramePr>
+              <a:graphicFrameLocks xmlns:a="http://schemas.openxmlformats.org/drawingml/2006/main" noChangeAspect="1"/>
+            </wp:cNvGraphicFramePr>
+            <a:graphic xmlns:a="http://schemas.openxmlformats.org/drawingml/2006/main">
+              <a:graphicData uri="http://schemas.openxmlformats.org/drawingml/2006/picture">
+                <pic:pic xmlns:pic="http://schemas.openxmlformats.org/drawingml/2006/picture">
+                  <pic:nvPicPr>
+                    <pic:cNvPr id="2" name="wise.png"/>
+                    <pic:cNvPicPr/>
+                  </pic:nvPicPr>
+                  <pic:blipFill>
+                    <a:blip r:embed="rId8">
+                      <a:extLst>
+                        <a:ext uri="{28A0092B-C50C-407E-A947-70E740481C1C}">
+                          <a14:useLocalDpi xmlns:a14="http://schemas.microsoft.com/office/drawing/2010/main" val="0"/>
+                        </a:ext>
+                      </a:extLst>
+                    </a:blip>
+                    <a:stretch>
+                      <a:fillRect/>
+                    </a:stretch>
+                  </pic:blipFill>
+                  <pic:spPr>
+                    <a:xfrm>
+                      <a:off x="0" y="0"/>
+                      <a:ext cx="5760085" cy="2650490"/>
+                    </a:xfrm>
+                    <a:prstGeom prst="rect">
+                      <a:avLst/>
+                    </a:prstGeom>
+                  </pic:spPr>
+                </pic:pic>
+              </a:graphicData>
+            </a:graphic>
+          </wp:inline>
+        </w:drawing>
+      </w:r>
+    </w:p>
+    <w:p>
+      <w:pPr>
+        <w:pStyle w:val="PargrafodaLista"/>
+        <w:ind w:left="400" w:firstLine="308"/>
+        <w:jc w:val="both"/>
+        <w:rPr>
+          <w:rFonts w:asciiTheme="minorHAnsi" w:hAnsiTheme="minorHAnsi" w:cstheme="minorHAnsi"/>
+          <w:szCs w:val="24"/>
+          <w:bdr w:val="none" w:sz="0" w:space="0" w:color="auto" w:frame="1"/>
+        </w:rPr>
+      </w:pPr>
+      <w:r>
+        <w:rPr>
+          <w:rFonts w:asciiTheme="minorHAnsi" w:hAnsiTheme="minorHAnsi" w:cstheme="minorHAnsi"/>
+          <w:noProof/>
+          <w:szCs w:val="24"/>
+          <w:bdr w:val="none" w:sz="0" w:space="0" w:color="auto" w:frame="1"/>
+          <w:lang w:eastAsia="pt-BR"/>
+        </w:rPr>
+        <w:drawing>
+          <wp:inline distT="0" distB="0" distL="0" distR="0" wp14:anchorId="3CA32AA6" wp14:editId="06B6CA1B">
+            <wp:extent cx="5760085" cy="1107440"/>
+            <wp:effectExtent l="0" t="0" r="0" b="0"/>
+            <wp:docPr id="3" name="Imagem 3"/>
+            <wp:cNvGraphicFramePr>
+              <a:graphicFrameLocks xmlns:a="http://schemas.openxmlformats.org/drawingml/2006/main" noChangeAspect="1"/>
+            </wp:cNvGraphicFramePr>
+            <a:graphic xmlns:a="http://schemas.openxmlformats.org/drawingml/2006/main">
+              <a:graphicData uri="http://schemas.openxmlformats.org/drawingml/2006/picture">
+                <pic:pic xmlns:pic="http://schemas.openxmlformats.org/drawingml/2006/picture">
+                  <pic:nvPicPr>
+                    <pic:cNvPr id="3" name="ORGANIZZE.png"/>
+                    <pic:cNvPicPr/>
+                  </pic:nvPicPr>
+                  <pic:blipFill>
+                    <a:blip r:embed="rId9" cstate="print">
+                      <a:extLst>
+                        <a:ext uri="{28A0092B-C50C-407E-A947-70E740481C1C}">
+                          <a14:useLocalDpi xmlns:a14="http://schemas.microsoft.com/office/drawing/2010/main" val="0"/>
+                        </a:ext>
+                      </a:extLst>
+                    </a:blip>
+                    <a:stretch>
+                      <a:fillRect/>
+                    </a:stretch>
+                  </pic:blipFill>
+                  <pic:spPr>
+                    <a:xfrm>
+                      <a:off x="0" y="0"/>
+                      <a:ext cx="5760085" cy="1107440"/>
+                    </a:xfrm>
+                    <a:prstGeom prst="rect">
+                      <a:avLst/>
+                    </a:prstGeom>
+                  </pic:spPr>
+                </pic:pic>
+              </a:graphicData>
+            </a:graphic>
+          </wp:inline>
+        </w:drawing>
+      </w:r>
+    </w:p>
+    <w:p>
+      <w:pPr>
+        <w:pStyle w:val="PargrafodaLista"/>
+        <w:ind w:left="400" w:firstLine="308"/>
+        <w:jc w:val="both"/>
+        <w:rPr>
+          <w:rFonts w:asciiTheme="minorHAnsi" w:hAnsiTheme="minorHAnsi" w:cstheme="minorHAnsi"/>
+          <w:szCs w:val="24"/>
+          <w:bdr w:val="none" w:sz="0" w:space="0" w:color="auto" w:frame="1"/>
+        </w:rPr>
+      </w:pPr>
+      <w:r>
+        <w:rPr>
+          <w:rFonts w:asciiTheme="minorHAnsi" w:hAnsiTheme="minorHAnsi" w:cstheme="minorHAnsi"/>
+          <w:noProof/>
+          <w:szCs w:val="24"/>
+          <w:bdr w:val="none" w:sz="0" w:space="0" w:color="auto" w:frame="1"/>
+          <w:lang w:eastAsia="pt-BR"/>
+        </w:rPr>
+        <w:lastRenderedPageBreak/>
+        <w:drawing>
+          <wp:inline distT="0" distB="0" distL="0" distR="0" wp14:anchorId="154C28C5" wp14:editId="7B5362D7">
+            <wp:extent cx="4113494" cy="2700508"/>
+            <wp:effectExtent l="0" t="0" r="1905" b="5080"/>
+            <wp:docPr id="5" name="Imagem 5"/>
+            <wp:cNvGraphicFramePr>
+              <a:graphicFrameLocks xmlns:a="http://schemas.openxmlformats.org/drawingml/2006/main" noChangeAspect="1"/>
+            </wp:cNvGraphicFramePr>
+            <a:graphic xmlns:a="http://schemas.openxmlformats.org/drawingml/2006/main">
+              <a:graphicData uri="http://schemas.openxmlformats.org/drawingml/2006/picture">
+                <pic:pic xmlns:pic="http://schemas.openxmlformats.org/drawingml/2006/picture">
+                  <pic:nvPicPr>
+                    <pic:cNvPr id="5" name="meta por grafico de pizza minhas.png"/>
+                    <pic:cNvPicPr/>
+                  </pic:nvPicPr>
+                  <pic:blipFill>
+                    <a:blip r:embed="rId10">
+                      <a:extLst>
+                        <a:ext uri="{28A0092B-C50C-407E-A947-70E740481C1C}">
+                          <a14:useLocalDpi xmlns:a14="http://schemas.microsoft.com/office/drawing/2010/main" val="0"/>
+                        </a:ext>
+                      </a:extLst>
+                    </a:blip>
+                    <a:stretch>
+                      <a:fillRect/>
+                    </a:stretch>
+                  </pic:blipFill>
+                  <pic:spPr>
+                    <a:xfrm>
+                      <a:off x="0" y="0"/>
+                      <a:ext cx="4140264" cy="2718082"/>
+                    </a:xfrm>
+                    <a:prstGeom prst="rect">
+                      <a:avLst/>
+                    </a:prstGeom>
+                  </pic:spPr>
+                </pic:pic>
+              </a:graphicData>
+            </a:graphic>
+          </wp:inline>
+        </w:drawing>
+      </w:r>
+      <w:r>
+        <w:rPr>
+          <w:rFonts w:asciiTheme="minorHAnsi" w:hAnsiTheme="minorHAnsi" w:cstheme="minorHAnsi"/>
+          <w:noProof/>
+          <w:szCs w:val="24"/>
+          <w:bdr w:val="none" w:sz="0" w:space="0" w:color="auto" w:frame="1"/>
+          <w:lang w:eastAsia="pt-BR"/>
+        </w:rPr>
+        <w:drawing>
+          <wp:inline distT="0" distB="0" distL="0" distR="0" wp14:anchorId="4C090C40" wp14:editId="3E98E70C">
+            <wp:extent cx="5759446" cy="1969477"/>
+            <wp:effectExtent l="0" t="0" r="0" b="0"/>
+            <wp:docPr id="4" name="Imagem 4"/>
+            <wp:cNvGraphicFramePr>
+              <a:graphicFrameLocks xmlns:a="http://schemas.openxmlformats.org/drawingml/2006/main" noChangeAspect="1"/>
+            </wp:cNvGraphicFramePr>
+            <a:graphic xmlns:a="http://schemas.openxmlformats.org/drawingml/2006/main">
+              <a:graphicData uri="http://schemas.openxmlformats.org/drawingml/2006/picture">
+                <pic:pic xmlns:pic="http://schemas.openxmlformats.org/drawingml/2006/picture">
+                  <pic:nvPicPr>
+                    <pic:cNvPr id="4" name="grafico.png"/>
+                    <pic:cNvPicPr/>
+                  </pic:nvPicPr>
+                  <pic:blipFill>
+                    <a:blip r:embed="rId11">
+                      <a:extLst>
+                        <a:ext uri="{28A0092B-C50C-407E-A947-70E740481C1C}">
+                          <a14:useLocalDpi xmlns:a14="http://schemas.microsoft.com/office/drawing/2010/main" val="0"/>
+                        </a:ext>
+                      </a:extLst>
+                    </a:blip>
+                    <a:stretch>
+                      <a:fillRect/>
+                    </a:stretch>
+                  </pic:blipFill>
+                  <pic:spPr>
+                    <a:xfrm>
+                      <a:off x="0" y="0"/>
+                      <a:ext cx="5801555" cy="1983877"/>
+                    </a:xfrm>
+                    <a:prstGeom prst="rect">
+                      <a:avLst/>
+                    </a:prstGeom>
+                  </pic:spPr>
+                </pic:pic>
+              </a:graphicData>
+            </a:graphic>
+          </wp:inline>
+        </w:drawing>
+      </w:r>
+    </w:p>
+    <w:p>
+      <w:pPr>
+        <w:pStyle w:val="PargrafodaLista"/>
         <w:numPr>
           <w:ilvl w:val="1"/>
           <w:numId w:val="32"/>
@@ -1259,7 +1496,15 @@
         <w:rPr>
           <w:bdr w:val="none" w:sz="0" w:space="0" w:color="auto" w:frame="1"/>
         </w:rPr>
-        <w:t>A proposta para o desenvolvimento de um sistema de controle financeiro pessoal busca criar uma plataforma eficiente, intuitiva e personalizada, que ajude os usuários a gerenciar suas finanças de maneira prática e eficaz. O sistema permitirá o controle detalhado de despesas e receitas, com a categorização das transações. Além disso, será possível definir metas financeiras personalizadas, como poupança para uma viagem ou pagamento de dívidas, acompanhando o progresso por meio de gráficos e notificações que incentivam o alcance dessas metas. Para melhorar a gestão financeira, o sistema incluirá relatórios detalhados e gráficos interativos que permitirão ao usuário visualizar de forma clara como estão seus gastos e receitas, além de identificar tendências ao longo do tempo. A interface do aplicativo será simples e intuitiva, proporcionando uma navegação fácil e ágil, com acesso rápido às funções principais, como controle de despesas, metas e relatórios. O design será clean, com o uso de ícones e cores para tornar o uso ainda mais fluido.</w:t>
+        <w:t>A proposta para o desenvolvimento de um sistema de controle financeiro pessoal busca criar uma plataforma eficiente, intuitiva e personalizada, que ajude os usuários a gerenciar suas finanças de maneira prática e eficaz. O sistema permitirá o controle detalhado de despesas e receitas, com</w:t>
+      </w:r>
+      <w:bookmarkStart w:id="0" w:name="_GoBack"/>
+      <w:bookmarkEnd w:id="0"/>
+      <w:r>
+        <w:rPr>
+          <w:bdr w:val="none" w:sz="0" w:space="0" w:color="auto" w:frame="1"/>
+        </w:rPr>
+        <w:t xml:space="preserve"> a categorização das transações. Além disso, será possível definir metas financeiras personalizadas, como poupança para uma viagem ou pagamento de dívidas, acompanhando o progresso por meio de gráficos e notificações que incentivam o alcance dessas metas. Para melhorar a gestão financeira, o sistema incluirá relatórios detalhados e gráficos interativos que permitirão ao usuário visualizar de forma clara como estão seus gastos e receitas, além de identificar tendências ao longo do tempo. A interface do aplicativo será simples e intuitiva, proporcionando uma navegação fácil e ágil, com acesso rápido às funções principais, como controle de despesas, metas e relatórios. O design será clean, com o uso de ícones e cores para tornar o uso ainda mais fluido.</w:t>
       </w:r>
     </w:p>
     <w:p>
@@ -2064,8 +2309,6 @@
         </w:rPr>
         <w:t xml:space="preserve"> - Requisitos Funcionais</w:t>
       </w:r>
-      <w:bookmarkStart w:id="0" w:name="_GoBack"/>
-      <w:bookmarkEnd w:id="0"/>
     </w:p>
     <w:tbl>
       <w:tblPr>
@@ -2101,21 +2344,7 @@
                 <w:rFonts w:asciiTheme="minorHAnsi" w:hAnsiTheme="minorHAnsi" w:cstheme="minorHAnsi"/>
                 <w:szCs w:val="24"/>
               </w:rPr>
-              <w:t>Requisito</w:t>
-            </w:r>
-            <w:r>
-              <w:rPr>
-                <w:rFonts w:asciiTheme="minorHAnsi" w:hAnsiTheme="minorHAnsi" w:cstheme="minorHAnsi"/>
-                <w:szCs w:val="24"/>
-              </w:rPr>
-              <w:t xml:space="preserve"> Não</w:t>
-            </w:r>
-            <w:r>
-              <w:rPr>
-                <w:rFonts w:asciiTheme="minorHAnsi" w:hAnsiTheme="minorHAnsi" w:cstheme="minorHAnsi"/>
-                <w:szCs w:val="24"/>
-              </w:rPr>
-              <w:t xml:space="preserve"> Funcional</w:t>
+              <w:t>Requisito Não Funcional</w:t>
             </w:r>
           </w:p>
         </w:tc>
@@ -2142,14 +2371,7 @@
                 <w:rFonts w:asciiTheme="minorHAnsi" w:hAnsiTheme="minorHAnsi" w:cstheme="minorHAnsi"/>
                 <w:szCs w:val="24"/>
               </w:rPr>
-              <w:t>RF001</w:t>
-            </w:r>
-            <w:r>
-              <w:rPr>
-                <w:rFonts w:asciiTheme="minorHAnsi" w:hAnsiTheme="minorHAnsi" w:cstheme="minorHAnsi"/>
-                <w:szCs w:val="24"/>
-              </w:rPr>
-              <w:t>0</w:t>
+              <w:t>RF0010</w:t>
             </w:r>
           </w:p>
         </w:tc>
@@ -12119,7 +12341,7 @@
 </file>
 
 <file path=customXml/itemProps1.xml><?xml version="1.0" encoding="utf-8"?>
-<ds:datastoreItem xmlns:ds="http://schemas.openxmlformats.org/officeDocument/2006/customXml" ds:itemID="{ACE4B0C9-5D86-4BE0-A3B5-9CA88649C479}">
+<ds:datastoreItem xmlns:ds="http://schemas.openxmlformats.org/officeDocument/2006/customXml" ds:itemID="{172CFB29-1FF2-41AA-87A9-468F28621AC2}">
   <ds:schemaRefs>
     <ds:schemaRef ds:uri="http://schemas.openxmlformats.org/officeDocument/2006/bibliography"/>
   </ds:schemaRefs>

</xml_diff>

<commit_message>
alteração do codigo, identando metodos meta e banco
</commit_message>
<xml_diff>
--- a/docs/sistemas de gestão de finanças pessoais com metas - FINANÇAFACIL.docx
+++ b/docs/sistemas de gestão de finanças pessoais com metas - FINANÇAFACIL.docx
@@ -1496,148 +1496,149 @@
         <w:rPr>
           <w:bdr w:val="none" w:sz="0" w:space="0" w:color="auto" w:frame="1"/>
         </w:rPr>
-        <w:t>A proposta para o desenvolvimento de um sistema de controle financeiro pessoal busca criar uma plataforma eficiente, intuitiva e personalizada, que ajude os usuários a gerenciar suas finanças de maneira prática e eficaz. O sistema permitirá o controle detalhado de despesas e receitas, com</w:t>
+        <w:t>A proposta para o desenvolvimento de um sistema de controle financeiro pessoal busca criar uma plataforma eficiente, intuitiva e personalizada, que ajude os usuários a gerenciar suas finanças de maneira prática e eficaz. O sistema permitirá o controle detalhado de despesas e receitas, com a categorização das transações. Além disso, será possível definir metas financeiras personalizadas, como poupança para uma viagem ou pagamento de dívidas, acompanhando o progresso por meio de gráficos e notificações que incentivam o alcance dessas metas. Para melhorar a gestão financeira, o sistema incluirá relatórios detalhados e gráficos interativos que permitirão ao usuário visualizar de forma clara como estão seus gastos e receitas, além de identificar tendências ao longo do tempo. A interface do aplicativo será simples e intuitiva, proporcionando uma navegação fácil e ágil, com acesso rápido às funções principais, como controle de despesas, metas e relatórios. O design será clean, com o uso de ícones e cores para tornar o uso ainda mais fluido.</w:t>
+      </w:r>
+    </w:p>
+    <w:p>
+      <w:pPr>
+        <w:rPr>
+          <w:bdr w:val="none" w:sz="0" w:space="0" w:color="auto" w:frame="1"/>
+        </w:rPr>
+      </w:pPr>
+    </w:p>
+    <w:p>
+      <w:pPr>
+        <w:ind w:firstLine="0"/>
+        <w:jc w:val="both"/>
+        <w:rPr>
+          <w:rFonts w:asciiTheme="minorHAnsi" w:hAnsiTheme="minorHAnsi" w:cstheme="minorHAnsi"/>
+          <w:b/>
+          <w:bCs/>
+          <w:szCs w:val="24"/>
+        </w:rPr>
+      </w:pPr>
+      <w:r>
+        <w:rPr>
+          <w:rFonts w:asciiTheme="minorHAnsi" w:hAnsiTheme="minorHAnsi" w:cstheme="minorHAnsi"/>
+          <w:b/>
+          <w:bCs/>
+          <w:szCs w:val="24"/>
+        </w:rPr>
+        <w:lastRenderedPageBreak/>
+        <w:t>2</w:t>
+      </w:r>
+      <w:r>
+        <w:rPr>
+          <w:rFonts w:asciiTheme="minorHAnsi" w:hAnsiTheme="minorHAnsi" w:cstheme="minorHAnsi"/>
+          <w:b/>
+          <w:bCs/>
+          <w:szCs w:val="24"/>
+        </w:rPr>
+        <w:t xml:space="preserve"> </w:t>
+      </w:r>
+      <w:r>
+        <w:rPr>
+          <w:rFonts w:asciiTheme="minorHAnsi" w:hAnsiTheme="minorHAnsi" w:cstheme="minorHAnsi"/>
+          <w:b/>
+          <w:bCs/>
+          <w:szCs w:val="24"/>
+        </w:rPr>
+        <w:t>REQUISITOS DO SISTEMA</w:t>
+      </w:r>
+    </w:p>
+    <w:p>
+      <w:pPr>
+        <w:jc w:val="both"/>
+        <w:rPr>
+          <w:rFonts w:asciiTheme="minorHAnsi" w:hAnsiTheme="minorHAnsi" w:cstheme="minorHAnsi"/>
+          <w:szCs w:val="24"/>
+        </w:rPr>
+      </w:pPr>
+      <w:r>
+        <w:rPr>
+          <w:rFonts w:asciiTheme="minorHAnsi" w:hAnsiTheme="minorHAnsi" w:cstheme="minorHAnsi"/>
+          <w:szCs w:val="24"/>
+        </w:rPr>
+        <w:t>No contexto do sistema Finança Fácil, os requisitos suprem as necessidades, capacidades ou condições do usuário de atingir suas metas ou seus objetivos, os requisitos são essenciais para o programador, pois eles servem para orientar o desenvolvimento e assegurar que o sistema do site funcione sem erros conforme o esperado.</w:t>
+      </w:r>
+    </w:p>
+    <w:p>
+      <w:pPr>
+        <w:ind w:firstLine="0"/>
+        <w:jc w:val="both"/>
+        <w:rPr>
+          <w:rFonts w:asciiTheme="minorHAnsi" w:hAnsiTheme="minorHAnsi" w:cstheme="minorHAnsi"/>
+          <w:color w:val="FF0000"/>
+          <w:szCs w:val="24"/>
+        </w:rPr>
+      </w:pPr>
+    </w:p>
+    <w:p>
+      <w:pPr>
+        <w:jc w:val="both"/>
+        <w:rPr>
+          <w:rFonts w:asciiTheme="minorHAnsi" w:hAnsiTheme="minorHAnsi" w:cstheme="minorHAnsi"/>
+          <w:szCs w:val="24"/>
+        </w:rPr>
+      </w:pPr>
+    </w:p>
+    <w:p>
+      <w:pPr>
+        <w:jc w:val="both"/>
+        <w:rPr>
+          <w:rFonts w:asciiTheme="minorHAnsi" w:hAnsiTheme="minorHAnsi" w:cstheme="minorHAnsi"/>
+          <w:b/>
+          <w:szCs w:val="24"/>
+        </w:rPr>
+      </w:pPr>
+      <w:r>
+        <w:rPr>
+          <w:rFonts w:asciiTheme="minorHAnsi" w:hAnsiTheme="minorHAnsi" w:cstheme="minorHAnsi"/>
+          <w:b/>
+          <w:szCs w:val="24"/>
+        </w:rPr>
+        <w:t>2.</w:t>
+      </w:r>
+      <w:r>
+        <w:rPr>
+          <w:rFonts w:asciiTheme="minorHAnsi" w:hAnsiTheme="minorHAnsi" w:cstheme="minorHAnsi"/>
+          <w:b/>
+          <w:szCs w:val="24"/>
+        </w:rPr>
+        <w:t>1</w:t>
+      </w:r>
+      <w:r>
+        <w:rPr>
+          <w:rFonts w:asciiTheme="minorHAnsi" w:hAnsiTheme="minorHAnsi" w:cstheme="minorHAnsi"/>
+          <w:b/>
+          <w:szCs w:val="24"/>
+        </w:rPr>
+        <w:t xml:space="preserve"> Requisitos funcionais</w:t>
+      </w:r>
+    </w:p>
+    <w:p>
+      <w:pPr>
+        <w:jc w:val="both"/>
+        <w:rPr>
+          <w:rFonts w:asciiTheme="minorHAnsi" w:hAnsiTheme="minorHAnsi" w:cstheme="minorHAnsi"/>
+          <w:szCs w:val="24"/>
+        </w:rPr>
+      </w:pPr>
+      <w:r>
+        <w:rPr>
+          <w:rFonts w:asciiTheme="minorHAnsi" w:hAnsiTheme="minorHAnsi" w:cstheme="minorHAnsi"/>
+          <w:szCs w:val="24"/>
+        </w:rPr>
+        <w:t>Para garantir o funcionamento eficiente do sistema, suas funcionalidades devem ser c</w:t>
       </w:r>
       <w:bookmarkStart w:id="0" w:name="_GoBack"/>
       <w:bookmarkEnd w:id="0"/>
       <w:r>
         <w:rPr>
-          <w:bdr w:val="none" w:sz="0" w:space="0" w:color="auto" w:frame="1"/>
-        </w:rPr>
-        <w:t xml:space="preserve"> a categorização das transações. Além disso, será possível definir metas financeiras personalizadas, como poupança para uma viagem ou pagamento de dívidas, acompanhando o progresso por meio de gráficos e notificações que incentivam o alcance dessas metas. Para melhorar a gestão financeira, o sistema incluirá relatórios detalhados e gráficos interativos que permitirão ao usuário visualizar de forma clara como estão seus gastos e receitas, além de identificar tendências ao longo do tempo. A interface do aplicativo será simples e intuitiva, proporcionando uma navegação fácil e ágil, com acesso rápido às funções principais, como controle de despesas, metas e relatórios. O design será clean, com o uso de ícones e cores para tornar o uso ainda mais fluido.</w:t>
-      </w:r>
-    </w:p>
-    <w:p>
-      <w:pPr>
-        <w:rPr>
-          <w:bdr w:val="none" w:sz="0" w:space="0" w:color="auto" w:frame="1"/>
-        </w:rPr>
-      </w:pPr>
-    </w:p>
-    <w:p>
-      <w:pPr>
-        <w:ind w:firstLine="0"/>
-        <w:jc w:val="both"/>
-        <w:rPr>
-          <w:rFonts w:asciiTheme="minorHAnsi" w:hAnsiTheme="minorHAnsi" w:cstheme="minorHAnsi"/>
-          <w:b/>
-          <w:bCs/>
-          <w:szCs w:val="24"/>
-        </w:rPr>
-      </w:pPr>
-      <w:r>
-        <w:rPr>
-          <w:rFonts w:asciiTheme="minorHAnsi" w:hAnsiTheme="minorHAnsi" w:cstheme="minorHAnsi"/>
-          <w:b/>
-          <w:bCs/>
-          <w:szCs w:val="24"/>
-        </w:rPr>
-        <w:lastRenderedPageBreak/>
-        <w:t>2</w:t>
-      </w:r>
-      <w:r>
-        <w:rPr>
-          <w:rFonts w:asciiTheme="minorHAnsi" w:hAnsiTheme="minorHAnsi" w:cstheme="minorHAnsi"/>
-          <w:b/>
-          <w:bCs/>
-          <w:szCs w:val="24"/>
-        </w:rPr>
-        <w:t xml:space="preserve"> </w:t>
-      </w:r>
-      <w:r>
-        <w:rPr>
-          <w:rFonts w:asciiTheme="minorHAnsi" w:hAnsiTheme="minorHAnsi" w:cstheme="minorHAnsi"/>
-          <w:b/>
-          <w:bCs/>
-          <w:szCs w:val="24"/>
-        </w:rPr>
-        <w:t>REQUISITOS DO SISTEMA</w:t>
-      </w:r>
-    </w:p>
-    <w:p>
-      <w:pPr>
-        <w:jc w:val="both"/>
-        <w:rPr>
-          <w:rFonts w:asciiTheme="minorHAnsi" w:hAnsiTheme="minorHAnsi" w:cstheme="minorHAnsi"/>
-          <w:szCs w:val="24"/>
-        </w:rPr>
-      </w:pPr>
-      <w:r>
-        <w:rPr>
-          <w:rFonts w:asciiTheme="minorHAnsi" w:hAnsiTheme="minorHAnsi" w:cstheme="minorHAnsi"/>
-          <w:szCs w:val="24"/>
-        </w:rPr>
-        <w:t>No contexto do sistema Finança Fácil, os requisitos suprem as necessidades, capacidades ou condições do usuário de atingir suas metas ou seus objetivos, os requisitos são essenciais para o programador, pois eles servem para orientar o desenvolvimento e assegurar que o sistema do site funcione sem erros conforme o esperado.</w:t>
-      </w:r>
-    </w:p>
-    <w:p>
-      <w:pPr>
-        <w:ind w:firstLine="0"/>
-        <w:jc w:val="both"/>
-        <w:rPr>
-          <w:rFonts w:asciiTheme="minorHAnsi" w:hAnsiTheme="minorHAnsi" w:cstheme="minorHAnsi"/>
-          <w:color w:val="FF0000"/>
-          <w:szCs w:val="24"/>
-        </w:rPr>
-      </w:pPr>
-    </w:p>
-    <w:p>
-      <w:pPr>
-        <w:jc w:val="both"/>
-        <w:rPr>
-          <w:rFonts w:asciiTheme="minorHAnsi" w:hAnsiTheme="minorHAnsi" w:cstheme="minorHAnsi"/>
-          <w:szCs w:val="24"/>
-        </w:rPr>
-      </w:pPr>
-    </w:p>
-    <w:p>
-      <w:pPr>
-        <w:jc w:val="both"/>
-        <w:rPr>
-          <w:rFonts w:asciiTheme="minorHAnsi" w:hAnsiTheme="minorHAnsi" w:cstheme="minorHAnsi"/>
-          <w:b/>
-          <w:szCs w:val="24"/>
-        </w:rPr>
-      </w:pPr>
-      <w:r>
-        <w:rPr>
-          <w:rFonts w:asciiTheme="minorHAnsi" w:hAnsiTheme="minorHAnsi" w:cstheme="minorHAnsi"/>
-          <w:b/>
-          <w:szCs w:val="24"/>
-        </w:rPr>
-        <w:t>2.</w:t>
-      </w:r>
-      <w:r>
-        <w:rPr>
-          <w:rFonts w:asciiTheme="minorHAnsi" w:hAnsiTheme="minorHAnsi" w:cstheme="minorHAnsi"/>
-          <w:b/>
-          <w:szCs w:val="24"/>
-        </w:rPr>
-        <w:t>1</w:t>
-      </w:r>
-      <w:r>
-        <w:rPr>
-          <w:rFonts w:asciiTheme="minorHAnsi" w:hAnsiTheme="minorHAnsi" w:cstheme="minorHAnsi"/>
-          <w:b/>
-          <w:szCs w:val="24"/>
-        </w:rPr>
-        <w:t xml:space="preserve"> Requisitos funcionais</w:t>
-      </w:r>
-    </w:p>
-    <w:p>
-      <w:pPr>
-        <w:jc w:val="both"/>
-        <w:rPr>
-          <w:rFonts w:asciiTheme="minorHAnsi" w:hAnsiTheme="minorHAnsi" w:cstheme="minorHAnsi"/>
-          <w:szCs w:val="24"/>
-        </w:rPr>
-      </w:pPr>
-      <w:r>
-        <w:rPr>
-          <w:rFonts w:asciiTheme="minorHAnsi" w:hAnsiTheme="minorHAnsi" w:cstheme="minorHAnsi"/>
-          <w:szCs w:val="24"/>
-        </w:rPr>
-        <w:t>Para garantir o funcionamento eficiente do sistema, suas funcionalidades devem ser claramente definidas. Os requisitos funcionais descrevem as operações essenciais, como controle de receitas e despesas, geração de relatórios e gestão de contas, determinando como o sistema deve responder a diferentes entradas. Um bom detalhamento desses requisitos assegura que o sistema atenda às necessidades dos usuários e funcione cor</w:t>
+          <w:rFonts w:asciiTheme="minorHAnsi" w:hAnsiTheme="minorHAnsi" w:cstheme="minorHAnsi"/>
+          <w:szCs w:val="24"/>
+        </w:rPr>
+        <w:t>laramente definidas. Os requisitos funcionais descrevem as operações essenciais, como controle de receitas e despesas, geração de relatórios e gestão de contas, determinando como o sistema deve responder a diferentes entradas. Um bom detalhamento desses requisitos assegura que o sistema atenda às necessidades dos usuários e funcione cor</w:t>
       </w:r>
       <w:r>
         <w:rPr>
@@ -2753,11 +2754,30 @@
           <w:szCs w:val="24"/>
         </w:rPr>
       </w:pPr>
-      <w:r>
-        <w:rPr>
-          <w:rFonts w:asciiTheme="minorHAnsi" w:hAnsiTheme="minorHAnsi" w:cstheme="minorHAnsi"/>
-          <w:szCs w:val="24"/>
-        </w:rPr>
+    </w:p>
+    <w:p>
+      <w:pPr>
+        <w:jc w:val="both"/>
+        <w:rPr>
+          <w:rFonts w:asciiTheme="minorHAnsi" w:hAnsiTheme="minorHAnsi" w:cstheme="minorHAnsi"/>
+          <w:szCs w:val="24"/>
+        </w:rPr>
+      </w:pPr>
+    </w:p>
+    <w:p>
+      <w:pPr>
+        <w:jc w:val="both"/>
+        <w:rPr>
+          <w:rFonts w:asciiTheme="minorHAnsi" w:hAnsiTheme="minorHAnsi" w:cstheme="minorHAnsi"/>
+          <w:szCs w:val="24"/>
+        </w:rPr>
+      </w:pPr>
+      <w:r>
+        <w:rPr>
+          <w:rFonts w:asciiTheme="minorHAnsi" w:hAnsiTheme="minorHAnsi" w:cstheme="minorHAnsi"/>
+          <w:szCs w:val="24"/>
+        </w:rPr>
+        <w:lastRenderedPageBreak/>
         <w:t>Pós-condição:</w:t>
       </w:r>
     </w:p>
@@ -2779,7 +2799,6 @@
           <w:rFonts w:asciiTheme="minorHAnsi" w:hAnsiTheme="minorHAnsi" w:cstheme="minorHAnsi"/>
           <w:szCs w:val="24"/>
         </w:rPr>
-        <w:lastRenderedPageBreak/>
         <w:t>O cliente cadastrado</w:t>
       </w:r>
       <w:r>
@@ -12341,7 +12360,7 @@
 </file>
 
 <file path=customXml/itemProps1.xml><?xml version="1.0" encoding="utf-8"?>
-<ds:datastoreItem xmlns:ds="http://schemas.openxmlformats.org/officeDocument/2006/customXml" ds:itemID="{172CFB29-1FF2-41AA-87A9-468F28621AC2}">
+<ds:datastoreItem xmlns:ds="http://schemas.openxmlformats.org/officeDocument/2006/customXml" ds:itemID="{351F8F1C-012C-450D-9012-A750F77DEE53}">
   <ds:schemaRefs>
     <ds:schemaRef ds:uri="http://schemas.openxmlformats.org/officeDocument/2006/bibliography"/>
   </ds:schemaRefs>

</xml_diff>

<commit_message>
adicionando no domunendo o capítulo 3, denominado MODELAGEM, e escrevendo sobre a modelagem do software
</commit_message>
<xml_diff>
--- a/docs/sistemas de gestão de finanças pessoais com metas - FINANÇAFACIL.docx
+++ b/docs/sistemas de gestão de finanças pessoais com metas - FINANÇAFACIL.docx
@@ -773,11 +773,12 @@
     </w:p>
     <w:p>
       <w:pPr>
-        <w:jc w:val="both"/>
-      </w:pPr>
-    </w:p>
-    <w:p>
-      <w:pPr>
+        <w:ind w:firstLine="0"/>
+      </w:pPr>
+    </w:p>
+    <w:p>
+      <w:pPr>
+        <w:ind w:firstLine="0"/>
         <w:jc w:val="center"/>
         <w:rPr>
           <w:b/>
@@ -795,7 +796,6 @@
     </w:p>
     <w:p>
       <w:pPr>
-        <w:jc w:val="center"/>
         <w:rPr>
           <w:b/>
           <w:bCs/>
@@ -1629,16 +1629,7 @@
           <w:rFonts w:asciiTheme="minorHAnsi" w:hAnsiTheme="minorHAnsi" w:cstheme="minorHAnsi"/>
           <w:szCs w:val="24"/>
         </w:rPr>
-        <w:t>Para garantir o funcionamento eficiente do sistema, suas funcionalidades devem ser c</w:t>
-      </w:r>
-      <w:bookmarkStart w:id="0" w:name="_GoBack"/>
-      <w:bookmarkEnd w:id="0"/>
-      <w:r>
-        <w:rPr>
-          <w:rFonts w:asciiTheme="minorHAnsi" w:hAnsiTheme="minorHAnsi" w:cstheme="minorHAnsi"/>
-          <w:szCs w:val="24"/>
-        </w:rPr>
-        <w:t>laramente definidas. Os requisitos funcionais descrevem as operações essenciais, como controle de receitas e despesas, geração de relatórios e gestão de contas, determinando como o sistema deve responder a diferentes entradas. Um bom detalhamento desses requisitos assegura que o sistema atenda às necessidades dos usuários e funcione cor</w:t>
+        <w:t>Para garantir o funcionamento eficiente do sistema, suas funcionalidades devem ser claramente definidas. Os requisitos funcionais descrevem as operações essenciais, como controle de receitas e despesas, geração de relatórios e gestão de contas, determinando como o sistema deve responder a diferentes entradas. Um bom detalhamento desses requisitos assegura que o sistema atenda às necessidades dos usuários e funcione cor</w:t>
       </w:r>
       <w:r>
         <w:rPr>
@@ -6075,6 +6066,72 @@
     </w:p>
     <w:p>
       <w:pPr>
+        <w:jc w:val="both"/>
+        <w:rPr>
+          <w:rFonts w:asciiTheme="minorHAnsi" w:hAnsiTheme="minorHAnsi" w:cstheme="minorHAnsi"/>
+          <w:szCs w:val="24"/>
+        </w:rPr>
+      </w:pPr>
+    </w:p>
+    <w:p>
+      <w:pPr>
+        <w:jc w:val="both"/>
+        <w:rPr>
+          <w:rFonts w:asciiTheme="minorHAnsi" w:hAnsiTheme="minorHAnsi" w:cstheme="minorHAnsi"/>
+          <w:szCs w:val="24"/>
+        </w:rPr>
+      </w:pPr>
+    </w:p>
+    <w:p>
+      <w:pPr>
+        <w:jc w:val="both"/>
+        <w:rPr>
+          <w:rFonts w:asciiTheme="minorHAnsi" w:hAnsiTheme="minorHAnsi" w:cstheme="minorHAnsi"/>
+          <w:b/>
+          <w:szCs w:val="24"/>
+        </w:rPr>
+      </w:pPr>
+      <w:r>
+        <w:rPr>
+          <w:rFonts w:asciiTheme="minorHAnsi" w:hAnsiTheme="minorHAnsi" w:cstheme="minorHAnsi"/>
+          <w:b/>
+          <w:szCs w:val="24"/>
+        </w:rPr>
+        <w:lastRenderedPageBreak/>
+        <w:t xml:space="preserve">3. MODELAGEM </w:t>
+      </w:r>
+      <w:r>
+        <w:rPr>
+          <w:rFonts w:asciiTheme="minorHAnsi" w:hAnsiTheme="minorHAnsi" w:cstheme="minorHAnsi"/>
+          <w:b/>
+          <w:szCs w:val="24"/>
+        </w:rPr>
+        <w:tab/>
+      </w:r>
+    </w:p>
+    <w:p>
+      <w:pPr>
+        <w:jc w:val="both"/>
+        <w:rPr>
+          <w:rFonts w:asciiTheme="minorHAnsi" w:hAnsiTheme="minorHAnsi" w:cstheme="minorHAnsi"/>
+          <w:b/>
+          <w:szCs w:val="24"/>
+        </w:rPr>
+      </w:pPr>
+      <w:bookmarkStart w:id="0" w:name="_GoBack"/>
+      <w:bookmarkEnd w:id="0"/>
+    </w:p>
+    <w:p>
+      <w:pPr>
+        <w:jc w:val="both"/>
+        <w:rPr>
+          <w:rFonts w:asciiTheme="minorHAnsi" w:hAnsiTheme="minorHAnsi" w:cstheme="minorHAnsi"/>
+          <w:szCs w:val="24"/>
+        </w:rPr>
+      </w:pPr>
+    </w:p>
+    <w:p>
+      <w:pPr>
         <w:ind w:firstLine="0"/>
         <w:jc w:val="both"/>
         <w:rPr>
@@ -6782,6 +6839,127 @@
     </w:lvl>
   </w:abstractNum>
   <w:abstractNum w:abstractNumId="4" w15:restartNumberingAfterBreak="0">
+    <w:nsid w:val="08B65C0D"/>
+    <w:multiLevelType w:val="multilevel"/>
+    <w:tmpl w:val="56068B68"/>
+    <w:lvl w:ilvl="0">
+      <w:start w:val="1"/>
+      <w:numFmt w:val="decimal"/>
+      <w:lvlText w:val="%1."/>
+      <w:lvlJc w:val="left"/>
+      <w:pPr>
+        <w:ind w:left="720" w:hanging="360"/>
+      </w:pPr>
+      <w:rPr>
+        <w:rFonts w:hint="default"/>
+      </w:rPr>
+    </w:lvl>
+    <w:lvl w:ilvl="1">
+      <w:start w:val="1"/>
+      <w:numFmt w:val="decimal"/>
+      <w:isLgl/>
+      <w:lvlText w:val="%1.%2."/>
+      <w:lvlJc w:val="left"/>
+      <w:pPr>
+        <w:ind w:left="2110" w:hanging="720"/>
+      </w:pPr>
+      <w:rPr>
+        <w:rFonts w:hint="default"/>
+      </w:rPr>
+    </w:lvl>
+    <w:lvl w:ilvl="2">
+      <w:start w:val="1"/>
+      <w:numFmt w:val="decimal"/>
+      <w:isLgl/>
+      <w:lvlText w:val="%1.%2.%3."/>
+      <w:lvlJc w:val="left"/>
+      <w:pPr>
+        <w:ind w:left="3140" w:hanging="720"/>
+      </w:pPr>
+      <w:rPr>
+        <w:rFonts w:hint="default"/>
+      </w:rPr>
+    </w:lvl>
+    <w:lvl w:ilvl="3">
+      <w:start w:val="1"/>
+      <w:numFmt w:val="decimal"/>
+      <w:isLgl/>
+      <w:lvlText w:val="%1.%2.%3.%4."/>
+      <w:lvlJc w:val="left"/>
+      <w:pPr>
+        <w:ind w:left="4530" w:hanging="1080"/>
+      </w:pPr>
+      <w:rPr>
+        <w:rFonts w:hint="default"/>
+      </w:rPr>
+    </w:lvl>
+    <w:lvl w:ilvl="4">
+      <w:start w:val="1"/>
+      <w:numFmt w:val="decimal"/>
+      <w:isLgl/>
+      <w:lvlText w:val="%1.%2.%3.%4.%5."/>
+      <w:lvlJc w:val="left"/>
+      <w:pPr>
+        <w:ind w:left="5560" w:hanging="1080"/>
+      </w:pPr>
+      <w:rPr>
+        <w:rFonts w:hint="default"/>
+      </w:rPr>
+    </w:lvl>
+    <w:lvl w:ilvl="5">
+      <w:start w:val="1"/>
+      <w:numFmt w:val="decimal"/>
+      <w:isLgl/>
+      <w:lvlText w:val="%1.%2.%3.%4.%5.%6."/>
+      <w:lvlJc w:val="left"/>
+      <w:pPr>
+        <w:ind w:left="6950" w:hanging="1440"/>
+      </w:pPr>
+      <w:rPr>
+        <w:rFonts w:hint="default"/>
+      </w:rPr>
+    </w:lvl>
+    <w:lvl w:ilvl="6">
+      <w:start w:val="1"/>
+      <w:numFmt w:val="decimal"/>
+      <w:isLgl/>
+      <w:lvlText w:val="%1.%2.%3.%4.%5.%6.%7."/>
+      <w:lvlJc w:val="left"/>
+      <w:pPr>
+        <w:ind w:left="7980" w:hanging="1440"/>
+      </w:pPr>
+      <w:rPr>
+        <w:rFonts w:hint="default"/>
+      </w:rPr>
+    </w:lvl>
+    <w:lvl w:ilvl="7">
+      <w:start w:val="1"/>
+      <w:numFmt w:val="decimal"/>
+      <w:isLgl/>
+      <w:lvlText w:val="%1.%2.%3.%4.%5.%6.%7.%8."/>
+      <w:lvlJc w:val="left"/>
+      <w:pPr>
+        <w:ind w:left="9370" w:hanging="1800"/>
+      </w:pPr>
+      <w:rPr>
+        <w:rFonts w:hint="default"/>
+      </w:rPr>
+    </w:lvl>
+    <w:lvl w:ilvl="8">
+      <w:start w:val="1"/>
+      <w:numFmt w:val="decimal"/>
+      <w:isLgl/>
+      <w:lvlText w:val="%1.%2.%3.%4.%5.%6.%7.%8.%9."/>
+      <w:lvlJc w:val="left"/>
+      <w:pPr>
+        <w:ind w:left="10760" w:hanging="2160"/>
+      </w:pPr>
+      <w:rPr>
+        <w:rFonts w:hint="default"/>
+      </w:rPr>
+    </w:lvl>
+  </w:abstractNum>
+  <w:abstractNum w:abstractNumId="5" w15:restartNumberingAfterBreak="0">
     <w:nsid w:val="0B9A52D0"/>
     <w:multiLevelType w:val="hybridMultilevel"/>
     <w:tmpl w:val="4F78492C"/>
@@ -6894,7 +7072,7 @@
       </w:rPr>
     </w:lvl>
   </w:abstractNum>
-  <w:abstractNum w:abstractNumId="5" w15:restartNumberingAfterBreak="0">
+  <w:abstractNum w:abstractNumId="6" w15:restartNumberingAfterBreak="0">
     <w:nsid w:val="0D686EEF"/>
     <w:multiLevelType w:val="hybridMultilevel"/>
     <w:tmpl w:val="1854D5F4"/>
@@ -7007,7 +7185,7 @@
       </w:rPr>
     </w:lvl>
   </w:abstractNum>
-  <w:abstractNum w:abstractNumId="6" w15:restartNumberingAfterBreak="0">
+  <w:abstractNum w:abstractNumId="7" w15:restartNumberingAfterBreak="0">
     <w:nsid w:val="0DA47902"/>
     <w:multiLevelType w:val="hybridMultilevel"/>
     <w:tmpl w:val="DA08E162"/>
@@ -7120,7 +7298,7 @@
       </w:rPr>
     </w:lvl>
   </w:abstractNum>
-  <w:abstractNum w:abstractNumId="7" w15:restartNumberingAfterBreak="0">
+  <w:abstractNum w:abstractNumId="8" w15:restartNumberingAfterBreak="0">
     <w:nsid w:val="0DCE46AC"/>
     <w:multiLevelType w:val="hybridMultilevel"/>
     <w:tmpl w:val="11D2F766"/>
@@ -7233,7 +7411,7 @@
       </w:rPr>
     </w:lvl>
   </w:abstractNum>
-  <w:abstractNum w:abstractNumId="8" w15:restartNumberingAfterBreak="0">
+  <w:abstractNum w:abstractNumId="9" w15:restartNumberingAfterBreak="0">
     <w:nsid w:val="168E6F19"/>
     <w:multiLevelType w:val="hybridMultilevel"/>
     <w:tmpl w:val="5482899A"/>
@@ -7322,7 +7500,7 @@
       </w:pPr>
     </w:lvl>
   </w:abstractNum>
-  <w:abstractNum w:abstractNumId="9" w15:restartNumberingAfterBreak="0">
+  <w:abstractNum w:abstractNumId="10" w15:restartNumberingAfterBreak="0">
     <w:nsid w:val="1D44033D"/>
     <w:multiLevelType w:val="multilevel"/>
     <w:tmpl w:val="C896AFA8"/>
@@ -7435,7 +7613,7 @@
       </w:rPr>
     </w:lvl>
   </w:abstractNum>
-  <w:abstractNum w:abstractNumId="10" w15:restartNumberingAfterBreak="0">
+  <w:abstractNum w:abstractNumId="11" w15:restartNumberingAfterBreak="0">
     <w:nsid w:val="1F344666"/>
     <w:multiLevelType w:val="hybridMultilevel"/>
     <w:tmpl w:val="5210BC9E"/>
@@ -7548,7 +7726,7 @@
       </w:rPr>
     </w:lvl>
   </w:abstractNum>
-  <w:abstractNum w:abstractNumId="11" w15:restartNumberingAfterBreak="0">
+  <w:abstractNum w:abstractNumId="12" w15:restartNumberingAfterBreak="0">
     <w:nsid w:val="203A1303"/>
     <w:multiLevelType w:val="hybridMultilevel"/>
     <w:tmpl w:val="BF5E17CC"/>
@@ -7661,7 +7839,7 @@
       </w:rPr>
     </w:lvl>
   </w:abstractNum>
-  <w:abstractNum w:abstractNumId="12" w15:restartNumberingAfterBreak="0">
+  <w:abstractNum w:abstractNumId="13" w15:restartNumberingAfterBreak="0">
     <w:nsid w:val="20760292"/>
     <w:multiLevelType w:val="hybridMultilevel"/>
     <w:tmpl w:val="10FE30B8"/>
@@ -7750,7 +7928,7 @@
       </w:pPr>
     </w:lvl>
   </w:abstractNum>
-  <w:abstractNum w:abstractNumId="13" w15:restartNumberingAfterBreak="0">
+  <w:abstractNum w:abstractNumId="14" w15:restartNumberingAfterBreak="0">
     <w:nsid w:val="231C3080"/>
     <w:multiLevelType w:val="hybridMultilevel"/>
     <w:tmpl w:val="6046EBC6"/>
@@ -7839,7 +8017,7 @@
       </w:pPr>
     </w:lvl>
   </w:abstractNum>
-  <w:abstractNum w:abstractNumId="14" w15:restartNumberingAfterBreak="0">
+  <w:abstractNum w:abstractNumId="15" w15:restartNumberingAfterBreak="0">
     <w:nsid w:val="27A22931"/>
     <w:multiLevelType w:val="hybridMultilevel"/>
     <w:tmpl w:val="D8804672"/>
@@ -7952,7 +8130,7 @@
       </w:rPr>
     </w:lvl>
   </w:abstractNum>
-  <w:abstractNum w:abstractNumId="15" w15:restartNumberingAfterBreak="0">
+  <w:abstractNum w:abstractNumId="16" w15:restartNumberingAfterBreak="0">
     <w:nsid w:val="2A071A89"/>
     <w:multiLevelType w:val="hybridMultilevel"/>
     <w:tmpl w:val="786AD4B2"/>
@@ -8065,7 +8243,7 @@
       </w:rPr>
     </w:lvl>
   </w:abstractNum>
-  <w:abstractNum w:abstractNumId="16" w15:restartNumberingAfterBreak="0">
+  <w:abstractNum w:abstractNumId="17" w15:restartNumberingAfterBreak="0">
     <w:nsid w:val="2D3F0B89"/>
     <w:multiLevelType w:val="hybridMultilevel"/>
     <w:tmpl w:val="51E42296"/>
@@ -8178,7 +8356,7 @@
       </w:rPr>
     </w:lvl>
   </w:abstractNum>
-  <w:abstractNum w:abstractNumId="17" w15:restartNumberingAfterBreak="0">
+  <w:abstractNum w:abstractNumId="18" w15:restartNumberingAfterBreak="0">
     <w:nsid w:val="2FB436A2"/>
     <w:multiLevelType w:val="hybridMultilevel"/>
     <w:tmpl w:val="39889C8E"/>
@@ -8291,7 +8469,7 @@
       </w:rPr>
     </w:lvl>
   </w:abstractNum>
-  <w:abstractNum w:abstractNumId="18" w15:restartNumberingAfterBreak="0">
+  <w:abstractNum w:abstractNumId="19" w15:restartNumberingAfterBreak="0">
     <w:nsid w:val="30A85EE3"/>
     <w:multiLevelType w:val="hybridMultilevel"/>
     <w:tmpl w:val="077471FC"/>
@@ -8404,7 +8582,7 @@
       </w:rPr>
     </w:lvl>
   </w:abstractNum>
-  <w:abstractNum w:abstractNumId="19" w15:restartNumberingAfterBreak="0">
+  <w:abstractNum w:abstractNumId="20" w15:restartNumberingAfterBreak="0">
     <w:nsid w:val="33934671"/>
     <w:multiLevelType w:val="hybridMultilevel"/>
     <w:tmpl w:val="1C289B26"/>
@@ -8517,7 +8695,7 @@
       </w:rPr>
     </w:lvl>
   </w:abstractNum>
-  <w:abstractNum w:abstractNumId="20" w15:restartNumberingAfterBreak="0">
+  <w:abstractNum w:abstractNumId="21" w15:restartNumberingAfterBreak="0">
     <w:nsid w:val="35A96499"/>
     <w:multiLevelType w:val="hybridMultilevel"/>
     <w:tmpl w:val="0D862136"/>
@@ -8606,7 +8784,7 @@
       </w:pPr>
     </w:lvl>
   </w:abstractNum>
-  <w:abstractNum w:abstractNumId="21" w15:restartNumberingAfterBreak="0">
+  <w:abstractNum w:abstractNumId="22" w15:restartNumberingAfterBreak="0">
     <w:nsid w:val="35CF01D0"/>
     <w:multiLevelType w:val="hybridMultilevel"/>
     <w:tmpl w:val="1CB48BC2"/>
@@ -8695,7 +8873,7 @@
       </w:pPr>
     </w:lvl>
   </w:abstractNum>
-  <w:abstractNum w:abstractNumId="22" w15:restartNumberingAfterBreak="0">
+  <w:abstractNum w:abstractNumId="23" w15:restartNumberingAfterBreak="0">
     <w:nsid w:val="36CA1164"/>
     <w:multiLevelType w:val="hybridMultilevel"/>
     <w:tmpl w:val="B776CDD0"/>
@@ -8808,7 +8986,7 @@
       </w:rPr>
     </w:lvl>
   </w:abstractNum>
-  <w:abstractNum w:abstractNumId="23" w15:restartNumberingAfterBreak="0">
+  <w:abstractNum w:abstractNumId="24" w15:restartNumberingAfterBreak="0">
     <w:nsid w:val="3ACB3A44"/>
     <w:multiLevelType w:val="multilevel"/>
     <w:tmpl w:val="EEEC92B8"/>
@@ -8929,7 +9107,7 @@
       </w:rPr>
     </w:lvl>
   </w:abstractNum>
-  <w:abstractNum w:abstractNumId="24" w15:restartNumberingAfterBreak="0">
+  <w:abstractNum w:abstractNumId="25" w15:restartNumberingAfterBreak="0">
     <w:nsid w:val="3F9A35D7"/>
     <w:multiLevelType w:val="multilevel"/>
     <w:tmpl w:val="4B90366E"/>
@@ -9042,7 +9220,7 @@
       </w:rPr>
     </w:lvl>
   </w:abstractNum>
-  <w:abstractNum w:abstractNumId="25" w15:restartNumberingAfterBreak="0">
+  <w:abstractNum w:abstractNumId="26" w15:restartNumberingAfterBreak="0">
     <w:nsid w:val="40665C3A"/>
     <w:multiLevelType w:val="hybridMultilevel"/>
     <w:tmpl w:val="B4ACA95E"/>
@@ -9155,7 +9333,7 @@
       </w:rPr>
     </w:lvl>
   </w:abstractNum>
-  <w:abstractNum w:abstractNumId="26" w15:restartNumberingAfterBreak="0">
+  <w:abstractNum w:abstractNumId="27" w15:restartNumberingAfterBreak="0">
     <w:nsid w:val="41017EC8"/>
     <w:multiLevelType w:val="hybridMultilevel"/>
     <w:tmpl w:val="3B3CC634"/>
@@ -9268,7 +9446,7 @@
       </w:rPr>
     </w:lvl>
   </w:abstractNum>
-  <w:abstractNum w:abstractNumId="27" w15:restartNumberingAfterBreak="0">
+  <w:abstractNum w:abstractNumId="28" w15:restartNumberingAfterBreak="0">
     <w:nsid w:val="43B65DFE"/>
     <w:multiLevelType w:val="hybridMultilevel"/>
     <w:tmpl w:val="83F4A9B2"/>
@@ -9381,7 +9559,7 @@
       </w:rPr>
     </w:lvl>
   </w:abstractNum>
-  <w:abstractNum w:abstractNumId="28" w15:restartNumberingAfterBreak="0">
+  <w:abstractNum w:abstractNumId="29" w15:restartNumberingAfterBreak="0">
     <w:nsid w:val="453E2F46"/>
     <w:multiLevelType w:val="hybridMultilevel"/>
     <w:tmpl w:val="A11E9B4C"/>
@@ -9494,7 +9672,7 @@
       </w:rPr>
     </w:lvl>
   </w:abstractNum>
-  <w:abstractNum w:abstractNumId="29" w15:restartNumberingAfterBreak="0">
+  <w:abstractNum w:abstractNumId="30" w15:restartNumberingAfterBreak="0">
     <w:nsid w:val="483A178B"/>
     <w:multiLevelType w:val="hybridMultilevel"/>
     <w:tmpl w:val="C186E912"/>
@@ -9607,7 +9785,7 @@
       </w:rPr>
     </w:lvl>
   </w:abstractNum>
-  <w:abstractNum w:abstractNumId="30" w15:restartNumberingAfterBreak="0">
+  <w:abstractNum w:abstractNumId="31" w15:restartNumberingAfterBreak="0">
     <w:nsid w:val="4C9E11F2"/>
     <w:multiLevelType w:val="hybridMultilevel"/>
     <w:tmpl w:val="40EADF34"/>
@@ -9720,7 +9898,7 @@
       </w:rPr>
     </w:lvl>
   </w:abstractNum>
-  <w:abstractNum w:abstractNumId="31" w15:restartNumberingAfterBreak="0">
+  <w:abstractNum w:abstractNumId="32" w15:restartNumberingAfterBreak="0">
     <w:nsid w:val="4D353BD9"/>
     <w:multiLevelType w:val="hybridMultilevel"/>
     <w:tmpl w:val="6D86435E"/>
@@ -9833,7 +10011,7 @@
       </w:rPr>
     </w:lvl>
   </w:abstractNum>
-  <w:abstractNum w:abstractNumId="32" w15:restartNumberingAfterBreak="0">
+  <w:abstractNum w:abstractNumId="33" w15:restartNumberingAfterBreak="0">
     <w:nsid w:val="535816BF"/>
     <w:multiLevelType w:val="hybridMultilevel"/>
     <w:tmpl w:val="21F89CF2"/>
@@ -9946,7 +10124,7 @@
       </w:rPr>
     </w:lvl>
   </w:abstractNum>
-  <w:abstractNum w:abstractNumId="33" w15:restartNumberingAfterBreak="0">
+  <w:abstractNum w:abstractNumId="34" w15:restartNumberingAfterBreak="0">
     <w:nsid w:val="547002D0"/>
     <w:multiLevelType w:val="hybridMultilevel"/>
     <w:tmpl w:val="1D4EBAD0"/>
@@ -10059,7 +10237,7 @@
       </w:rPr>
     </w:lvl>
   </w:abstractNum>
-  <w:abstractNum w:abstractNumId="34" w15:restartNumberingAfterBreak="0">
+  <w:abstractNum w:abstractNumId="35" w15:restartNumberingAfterBreak="0">
     <w:nsid w:val="57CF5599"/>
     <w:multiLevelType w:val="hybridMultilevel"/>
     <w:tmpl w:val="6C849156"/>
@@ -10148,7 +10326,7 @@
       </w:pPr>
     </w:lvl>
   </w:abstractNum>
-  <w:abstractNum w:abstractNumId="35" w15:restartNumberingAfterBreak="0">
+  <w:abstractNum w:abstractNumId="36" w15:restartNumberingAfterBreak="0">
     <w:nsid w:val="5B384EF3"/>
     <w:multiLevelType w:val="hybridMultilevel"/>
     <w:tmpl w:val="9B94FE3E"/>
@@ -10261,7 +10439,7 @@
       </w:rPr>
     </w:lvl>
   </w:abstractNum>
-  <w:abstractNum w:abstractNumId="36" w15:restartNumberingAfterBreak="0">
+  <w:abstractNum w:abstractNumId="37" w15:restartNumberingAfterBreak="0">
     <w:nsid w:val="61F6573F"/>
     <w:multiLevelType w:val="multilevel"/>
     <w:tmpl w:val="AE0A5B5C"/>
@@ -10374,7 +10552,7 @@
       </w:rPr>
     </w:lvl>
   </w:abstractNum>
-  <w:abstractNum w:abstractNumId="37" w15:restartNumberingAfterBreak="0">
+  <w:abstractNum w:abstractNumId="38" w15:restartNumberingAfterBreak="0">
     <w:nsid w:val="63AD35D3"/>
     <w:multiLevelType w:val="hybridMultilevel"/>
     <w:tmpl w:val="8A80CC7E"/>
@@ -10487,7 +10665,7 @@
       </w:rPr>
     </w:lvl>
   </w:abstractNum>
-  <w:abstractNum w:abstractNumId="38" w15:restartNumberingAfterBreak="0">
+  <w:abstractNum w:abstractNumId="39" w15:restartNumberingAfterBreak="0">
     <w:nsid w:val="654128CF"/>
     <w:multiLevelType w:val="hybridMultilevel"/>
     <w:tmpl w:val="22626F2C"/>
@@ -10576,7 +10754,7 @@
       </w:pPr>
     </w:lvl>
   </w:abstractNum>
-  <w:abstractNum w:abstractNumId="39" w15:restartNumberingAfterBreak="0">
+  <w:abstractNum w:abstractNumId="40" w15:restartNumberingAfterBreak="0">
     <w:nsid w:val="67B71626"/>
     <w:multiLevelType w:val="hybridMultilevel"/>
     <w:tmpl w:val="AFD619C2"/>
@@ -10689,7 +10867,7 @@
       </w:rPr>
     </w:lvl>
   </w:abstractNum>
-  <w:abstractNum w:abstractNumId="40" w15:restartNumberingAfterBreak="0">
+  <w:abstractNum w:abstractNumId="41" w15:restartNumberingAfterBreak="0">
     <w:nsid w:val="68B64D36"/>
     <w:multiLevelType w:val="hybridMultilevel"/>
     <w:tmpl w:val="CEA05670"/>
@@ -10802,7 +10980,7 @@
       </w:rPr>
     </w:lvl>
   </w:abstractNum>
-  <w:abstractNum w:abstractNumId="41" w15:restartNumberingAfterBreak="0">
+  <w:abstractNum w:abstractNumId="42" w15:restartNumberingAfterBreak="0">
     <w:nsid w:val="6F9755A2"/>
     <w:multiLevelType w:val="hybridMultilevel"/>
     <w:tmpl w:val="D3AAD582"/>
@@ -10891,7 +11069,7 @@
       </w:pPr>
     </w:lvl>
   </w:abstractNum>
-  <w:abstractNum w:abstractNumId="42" w15:restartNumberingAfterBreak="0">
+  <w:abstractNum w:abstractNumId="43" w15:restartNumberingAfterBreak="0">
     <w:nsid w:val="77170B73"/>
     <w:multiLevelType w:val="hybridMultilevel"/>
     <w:tmpl w:val="2676E200"/>
@@ -10980,7 +11158,7 @@
       </w:pPr>
     </w:lvl>
   </w:abstractNum>
-  <w:abstractNum w:abstractNumId="43" w15:restartNumberingAfterBreak="0">
+  <w:abstractNum w:abstractNumId="44" w15:restartNumberingAfterBreak="0">
     <w:nsid w:val="7E014F32"/>
     <w:multiLevelType w:val="hybridMultilevel"/>
     <w:tmpl w:val="E48EADBA"/>
@@ -11093,7 +11271,7 @@
       </w:rPr>
     </w:lvl>
   </w:abstractNum>
-  <w:abstractNum w:abstractNumId="44" w15:restartNumberingAfterBreak="0">
+  <w:abstractNum w:abstractNumId="45" w15:restartNumberingAfterBreak="0">
     <w:nsid w:val="7E6119CE"/>
     <w:multiLevelType w:val="hybridMultilevel"/>
     <w:tmpl w:val="459CCB0E"/>
@@ -11207,52 +11385,52 @@
     </w:lvl>
   </w:abstractNum>
   <w:num w:numId="1">
-    <w:abstractNumId w:val="8"/>
+    <w:abstractNumId w:val="9"/>
   </w:num>
   <w:num w:numId="2">
-    <w:abstractNumId w:val="20"/>
+    <w:abstractNumId w:val="21"/>
   </w:num>
   <w:num w:numId="3">
-    <w:abstractNumId w:val="17"/>
+    <w:abstractNumId w:val="18"/>
   </w:num>
   <w:num w:numId="4">
-    <w:abstractNumId w:val="36"/>
+    <w:abstractNumId w:val="37"/>
   </w:num>
   <w:num w:numId="5">
-    <w:abstractNumId w:val="24"/>
+    <w:abstractNumId w:val="25"/>
   </w:num>
   <w:num w:numId="6">
     <w:abstractNumId w:val="0"/>
   </w:num>
   <w:num w:numId="7">
-    <w:abstractNumId w:val="12"/>
+    <w:abstractNumId w:val="13"/>
   </w:num>
   <w:num w:numId="8">
-    <w:abstractNumId w:val="23"/>
+    <w:abstractNumId w:val="24"/>
   </w:num>
   <w:num w:numId="9">
-    <w:abstractNumId w:val="41"/>
+    <w:abstractNumId w:val="42"/>
   </w:num>
   <w:num w:numId="10">
-    <w:abstractNumId w:val="13"/>
+    <w:abstractNumId w:val="14"/>
   </w:num>
   <w:num w:numId="11">
     <w:abstractNumId w:val="3"/>
   </w:num>
   <w:num w:numId="12">
-    <w:abstractNumId w:val="34"/>
+    <w:abstractNumId w:val="35"/>
   </w:num>
   <w:num w:numId="13">
-    <w:abstractNumId w:val="21"/>
+    <w:abstractNumId w:val="22"/>
   </w:num>
   <w:num w:numId="14">
-    <w:abstractNumId w:val="38"/>
+    <w:abstractNumId w:val="39"/>
   </w:num>
   <w:num w:numId="15">
-    <w:abstractNumId w:val="18"/>
+    <w:abstractNumId w:val="19"/>
   </w:num>
   <w:num w:numId="16">
-    <w:abstractNumId w:val="15"/>
+    <w:abstractNumId w:val="16"/>
   </w:num>
   <w:num w:numId="17">
     <w:abstractNumId w:val="1"/>
@@ -11261,85 +11439,88 @@
     <w:abstractNumId w:val="2"/>
   </w:num>
   <w:num w:numId="19">
-    <w:abstractNumId w:val="42"/>
+    <w:abstractNumId w:val="43"/>
   </w:num>
   <w:num w:numId="20">
+    <w:abstractNumId w:val="32"/>
+  </w:num>
+  <w:num w:numId="21">
+    <w:abstractNumId w:val="6"/>
+  </w:num>
+  <w:num w:numId="22">
+    <w:abstractNumId w:val="34"/>
+  </w:num>
+  <w:num w:numId="23">
+    <w:abstractNumId w:val="17"/>
+  </w:num>
+  <w:num w:numId="24">
+    <w:abstractNumId w:val="33"/>
+  </w:num>
+  <w:num w:numId="25">
+    <w:abstractNumId w:val="28"/>
+  </w:num>
+  <w:num w:numId="26">
+    <w:abstractNumId w:val="40"/>
+  </w:num>
+  <w:num w:numId="27">
+    <w:abstractNumId w:val="26"/>
+  </w:num>
+  <w:num w:numId="28">
+    <w:abstractNumId w:val="36"/>
+  </w:num>
+  <w:num w:numId="29">
+    <w:abstractNumId w:val="45"/>
+  </w:num>
+  <w:num w:numId="30">
+    <w:abstractNumId w:val="41"/>
+  </w:num>
+  <w:num w:numId="31">
+    <w:abstractNumId w:val="23"/>
+  </w:num>
+  <w:num w:numId="32">
+    <w:abstractNumId w:val="10"/>
+  </w:num>
+  <w:num w:numId="33">
+    <w:abstractNumId w:val="29"/>
+  </w:num>
+  <w:num w:numId="34">
+    <w:abstractNumId w:val="30"/>
+  </w:num>
+  <w:num w:numId="35">
+    <w:abstractNumId w:val="7"/>
+  </w:num>
+  <w:num w:numId="36">
+    <w:abstractNumId w:val="44"/>
+  </w:num>
+  <w:num w:numId="37">
+    <w:abstractNumId w:val="11"/>
+  </w:num>
+  <w:num w:numId="38">
+    <w:abstractNumId w:val="27"/>
+  </w:num>
+  <w:num w:numId="39">
+    <w:abstractNumId w:val="12"/>
+  </w:num>
+  <w:num w:numId="40">
+    <w:abstractNumId w:val="5"/>
+  </w:num>
+  <w:num w:numId="41">
+    <w:abstractNumId w:val="38"/>
+  </w:num>
+  <w:num w:numId="42">
+    <w:abstractNumId w:val="15"/>
+  </w:num>
+  <w:num w:numId="43">
+    <w:abstractNumId w:val="8"/>
+  </w:num>
+  <w:num w:numId="44">
     <w:abstractNumId w:val="31"/>
   </w:num>
-  <w:num w:numId="21">
-    <w:abstractNumId w:val="5"/>
+  <w:num w:numId="45">
+    <w:abstractNumId w:val="20"/>
   </w:num>
-  <w:num w:numId="22">
-    <w:abstractNumId w:val="33"/>
-  </w:num>
-  <w:num w:numId="23">
-    <w:abstractNumId w:val="16"/>
-  </w:num>
-  <w:num w:numId="24">
-    <w:abstractNumId w:val="32"/>
-  </w:num>
-  <w:num w:numId="25">
-    <w:abstractNumId w:val="27"/>
-  </w:num>
-  <w:num w:numId="26">
-    <w:abstractNumId w:val="39"/>
-  </w:num>
-  <w:num w:numId="27">
-    <w:abstractNumId w:val="25"/>
-  </w:num>
-  <w:num w:numId="28">
-    <w:abstractNumId w:val="35"/>
-  </w:num>
-  <w:num w:numId="29">
-    <w:abstractNumId w:val="44"/>
-  </w:num>
-  <w:num w:numId="30">
-    <w:abstractNumId w:val="40"/>
-  </w:num>
-  <w:num w:numId="31">
-    <w:abstractNumId w:val="22"/>
-  </w:num>
-  <w:num w:numId="32">
-    <w:abstractNumId w:val="9"/>
-  </w:num>
-  <w:num w:numId="33">
-    <w:abstractNumId w:val="28"/>
-  </w:num>
-  <w:num w:numId="34">
-    <w:abstractNumId w:val="29"/>
-  </w:num>
-  <w:num w:numId="35">
-    <w:abstractNumId w:val="6"/>
-  </w:num>
-  <w:num w:numId="36">
-    <w:abstractNumId w:val="43"/>
-  </w:num>
-  <w:num w:numId="37">
-    <w:abstractNumId w:val="10"/>
-  </w:num>
-  <w:num w:numId="38">
-    <w:abstractNumId w:val="26"/>
-  </w:num>
-  <w:num w:numId="39">
-    <w:abstractNumId w:val="11"/>
-  </w:num>
-  <w:num w:numId="40">
+  <w:num w:numId="46">
     <w:abstractNumId w:val="4"/>
-  </w:num>
-  <w:num w:numId="41">
-    <w:abstractNumId w:val="37"/>
-  </w:num>
-  <w:num w:numId="42">
-    <w:abstractNumId w:val="14"/>
-  </w:num>
-  <w:num w:numId="43">
-    <w:abstractNumId w:val="7"/>
-  </w:num>
-  <w:num w:numId="44">
-    <w:abstractNumId w:val="30"/>
-  </w:num>
-  <w:num w:numId="45">
-    <w:abstractNumId w:val="19"/>
   </w:num>
 </w:numbering>
 </file>
@@ -12360,7 +12541,7 @@
 </file>
 
 <file path=customXml/itemProps1.xml><?xml version="1.0" encoding="utf-8"?>
-<ds:datastoreItem xmlns:ds="http://schemas.openxmlformats.org/officeDocument/2006/customXml" ds:itemID="{351F8F1C-012C-450D-9012-A750F77DEE53}">
+<ds:datastoreItem xmlns:ds="http://schemas.openxmlformats.org/officeDocument/2006/customXml" ds:itemID="{D64DBE41-41A5-4807-ADE2-DBC716620197}">
   <ds:schemaRefs>
     <ds:schemaRef ds:uri="http://schemas.openxmlformats.org/officeDocument/2006/bibliography"/>
   </ds:schemaRefs>

</xml_diff>

<commit_message>
Ajustando img der e diagrama de classes da documenação
</commit_message>
<xml_diff>
--- a/docs/sistemas de gestão de finanças pessoais com metas - FINANÇAFACIL.docx
+++ b/docs/sistemas de gestão de finanças pessoais com metas - FINANÇAFACIL.docx
@@ -6154,12 +6154,244 @@
           <w:szCs w:val="24"/>
         </w:rPr>
       </w:pPr>
-      <w:r>
-        <w:rPr>
-          <w:rFonts w:asciiTheme="minorHAnsi" w:hAnsiTheme="minorHAnsi" w:cstheme="minorHAnsi"/>
-          <w:b/>
-          <w:szCs w:val="24"/>
-        </w:rPr>
+    </w:p>
+    <w:p>
+      <w:pPr>
+        <w:ind w:firstLine="0"/>
+        <w:jc w:val="both"/>
+        <w:rPr>
+          <w:rFonts w:asciiTheme="minorHAnsi" w:hAnsiTheme="minorHAnsi" w:cstheme="minorHAnsi"/>
+          <w:b/>
+          <w:szCs w:val="24"/>
+        </w:rPr>
+      </w:pPr>
+    </w:p>
+    <w:p>
+      <w:pPr>
+        <w:ind w:firstLine="0"/>
+        <w:jc w:val="both"/>
+        <w:rPr>
+          <w:rFonts w:asciiTheme="minorHAnsi" w:hAnsiTheme="minorHAnsi" w:cstheme="minorHAnsi"/>
+          <w:b/>
+          <w:szCs w:val="24"/>
+        </w:rPr>
+      </w:pPr>
+    </w:p>
+    <w:p>
+      <w:pPr>
+        <w:ind w:firstLine="0"/>
+        <w:jc w:val="both"/>
+        <w:rPr>
+          <w:rFonts w:asciiTheme="minorHAnsi" w:hAnsiTheme="minorHAnsi" w:cstheme="minorHAnsi"/>
+          <w:b/>
+          <w:szCs w:val="24"/>
+        </w:rPr>
+      </w:pPr>
+    </w:p>
+    <w:p>
+      <w:pPr>
+        <w:ind w:firstLine="0"/>
+        <w:jc w:val="both"/>
+        <w:rPr>
+          <w:rFonts w:asciiTheme="minorHAnsi" w:hAnsiTheme="minorHAnsi" w:cstheme="minorHAnsi"/>
+          <w:b/>
+          <w:szCs w:val="24"/>
+        </w:rPr>
+      </w:pPr>
+    </w:p>
+    <w:p>
+      <w:pPr>
+        <w:ind w:firstLine="0"/>
+        <w:jc w:val="both"/>
+        <w:rPr>
+          <w:rFonts w:asciiTheme="minorHAnsi" w:hAnsiTheme="minorHAnsi" w:cstheme="minorHAnsi"/>
+          <w:b/>
+          <w:szCs w:val="24"/>
+        </w:rPr>
+      </w:pPr>
+    </w:p>
+    <w:p>
+      <w:pPr>
+        <w:ind w:firstLine="0"/>
+        <w:jc w:val="both"/>
+        <w:rPr>
+          <w:rFonts w:asciiTheme="minorHAnsi" w:hAnsiTheme="minorHAnsi" w:cstheme="minorHAnsi"/>
+          <w:b/>
+          <w:szCs w:val="24"/>
+        </w:rPr>
+      </w:pPr>
+    </w:p>
+    <w:p>
+      <w:pPr>
+        <w:ind w:firstLine="0"/>
+        <w:jc w:val="both"/>
+        <w:rPr>
+          <w:rFonts w:asciiTheme="minorHAnsi" w:hAnsiTheme="minorHAnsi" w:cstheme="minorHAnsi"/>
+          <w:b/>
+          <w:szCs w:val="24"/>
+        </w:rPr>
+      </w:pPr>
+    </w:p>
+    <w:p>
+      <w:pPr>
+        <w:ind w:firstLine="0"/>
+        <w:jc w:val="both"/>
+        <w:rPr>
+          <w:rFonts w:asciiTheme="minorHAnsi" w:hAnsiTheme="minorHAnsi" w:cstheme="minorHAnsi"/>
+          <w:b/>
+          <w:szCs w:val="24"/>
+        </w:rPr>
+      </w:pPr>
+    </w:p>
+    <w:p>
+      <w:pPr>
+        <w:ind w:firstLine="0"/>
+        <w:jc w:val="both"/>
+        <w:rPr>
+          <w:rFonts w:asciiTheme="minorHAnsi" w:hAnsiTheme="minorHAnsi" w:cstheme="minorHAnsi"/>
+          <w:b/>
+          <w:szCs w:val="24"/>
+        </w:rPr>
+      </w:pPr>
+    </w:p>
+    <w:p>
+      <w:pPr>
+        <w:ind w:firstLine="0"/>
+        <w:jc w:val="both"/>
+        <w:rPr>
+          <w:rFonts w:asciiTheme="minorHAnsi" w:hAnsiTheme="minorHAnsi" w:cstheme="minorHAnsi"/>
+          <w:b/>
+          <w:szCs w:val="24"/>
+        </w:rPr>
+      </w:pPr>
+    </w:p>
+    <w:p>
+      <w:pPr>
+        <w:ind w:firstLine="0"/>
+        <w:jc w:val="both"/>
+        <w:rPr>
+          <w:rFonts w:asciiTheme="minorHAnsi" w:hAnsiTheme="minorHAnsi" w:cstheme="minorHAnsi"/>
+          <w:b/>
+          <w:szCs w:val="24"/>
+        </w:rPr>
+      </w:pPr>
+    </w:p>
+    <w:p>
+      <w:pPr>
+        <w:ind w:firstLine="0"/>
+        <w:jc w:val="both"/>
+        <w:rPr>
+          <w:rFonts w:asciiTheme="minorHAnsi" w:hAnsiTheme="minorHAnsi" w:cstheme="minorHAnsi"/>
+          <w:b/>
+          <w:szCs w:val="24"/>
+        </w:rPr>
+      </w:pPr>
+    </w:p>
+    <w:p>
+      <w:pPr>
+        <w:ind w:firstLine="0"/>
+        <w:jc w:val="both"/>
+        <w:rPr>
+          <w:rFonts w:asciiTheme="minorHAnsi" w:hAnsiTheme="minorHAnsi" w:cstheme="minorHAnsi"/>
+          <w:b/>
+          <w:szCs w:val="24"/>
+        </w:rPr>
+      </w:pPr>
+    </w:p>
+    <w:p>
+      <w:pPr>
+        <w:ind w:firstLine="0"/>
+        <w:jc w:val="both"/>
+        <w:rPr>
+          <w:rFonts w:asciiTheme="minorHAnsi" w:hAnsiTheme="minorHAnsi" w:cstheme="minorHAnsi"/>
+          <w:b/>
+          <w:szCs w:val="24"/>
+        </w:rPr>
+      </w:pPr>
+    </w:p>
+    <w:p>
+      <w:pPr>
+        <w:ind w:firstLine="0"/>
+        <w:jc w:val="both"/>
+        <w:rPr>
+          <w:rFonts w:asciiTheme="minorHAnsi" w:hAnsiTheme="minorHAnsi" w:cstheme="minorHAnsi"/>
+          <w:b/>
+          <w:szCs w:val="24"/>
+        </w:rPr>
+      </w:pPr>
+    </w:p>
+    <w:p>
+      <w:pPr>
+        <w:ind w:firstLine="0"/>
+        <w:jc w:val="both"/>
+        <w:rPr>
+          <w:rFonts w:asciiTheme="minorHAnsi" w:hAnsiTheme="minorHAnsi" w:cstheme="minorHAnsi"/>
+          <w:b/>
+          <w:szCs w:val="24"/>
+        </w:rPr>
+      </w:pPr>
+    </w:p>
+    <w:p>
+      <w:pPr>
+        <w:ind w:firstLine="0"/>
+        <w:jc w:val="both"/>
+        <w:rPr>
+          <w:rFonts w:asciiTheme="minorHAnsi" w:hAnsiTheme="minorHAnsi" w:cstheme="minorHAnsi"/>
+          <w:b/>
+          <w:szCs w:val="24"/>
+        </w:rPr>
+      </w:pPr>
+    </w:p>
+    <w:p>
+      <w:pPr>
+        <w:ind w:firstLine="0"/>
+        <w:jc w:val="both"/>
+        <w:rPr>
+          <w:rFonts w:asciiTheme="minorHAnsi" w:hAnsiTheme="minorHAnsi" w:cstheme="minorHAnsi"/>
+          <w:b/>
+          <w:szCs w:val="24"/>
+        </w:rPr>
+      </w:pPr>
+    </w:p>
+    <w:p>
+      <w:pPr>
+        <w:ind w:firstLine="0"/>
+        <w:jc w:val="both"/>
+        <w:rPr>
+          <w:rFonts w:asciiTheme="minorHAnsi" w:hAnsiTheme="minorHAnsi" w:cstheme="minorHAnsi"/>
+          <w:b/>
+          <w:szCs w:val="24"/>
+        </w:rPr>
+      </w:pPr>
+    </w:p>
+    <w:p>
+      <w:pPr>
+        <w:ind w:firstLine="0"/>
+        <w:jc w:val="both"/>
+        <w:rPr>
+          <w:rFonts w:asciiTheme="minorHAnsi" w:hAnsiTheme="minorHAnsi" w:cstheme="minorHAnsi"/>
+          <w:b/>
+          <w:szCs w:val="24"/>
+        </w:rPr>
+      </w:pPr>
+    </w:p>
+    <w:p>
+      <w:pPr>
+        <w:ind w:firstLine="0"/>
+        <w:jc w:val="both"/>
+        <w:rPr>
+          <w:rFonts w:asciiTheme="minorHAnsi" w:hAnsiTheme="minorHAnsi" w:cstheme="minorHAnsi"/>
+          <w:b/>
+          <w:szCs w:val="24"/>
+        </w:rPr>
+      </w:pPr>
+      <w:r>
+        <w:rPr>
+          <w:rFonts w:asciiTheme="minorHAnsi" w:hAnsiTheme="minorHAnsi" w:cstheme="minorHAnsi"/>
+          <w:b/>
+          <w:szCs w:val="24"/>
+        </w:rPr>
+        <w:lastRenderedPageBreak/>
         <w:t>3.1 DIAGRAMA DE CLASSE</w:t>
       </w:r>
     </w:p>
@@ -6185,7 +6417,21 @@
           <w:rFonts w:asciiTheme="minorHAnsi" w:hAnsiTheme="minorHAnsi" w:cstheme="minorHAnsi"/>
           <w:szCs w:val="24"/>
         </w:rPr>
-        <w:t>O diagrama de classes organiza as partes do sistema, como "Cliente", "Metas" e "Banco", mostrando suas relações. Auxiliando o programador na hora do back-end, na criação dos atributos e métodos, mostrando claramente o que devemos fazer, como os parâmetros das funções serão e como se relacionarão. O diagrama de classes da Finança Fácil tem como por exemplo esses atributos e métodos mostrados na figura 1.</w:t>
+        <w:t>O diagrama de classes organiza as partes do sistema, como "Cliente", "Metas" e "Banco", mostrando suas relações. Auxiliando o programador na hora do back-end, na criação dos atributos e métodos, mostrando claramente o que devemos fazer, como os parâmetros das funções serão e como se relacionarão. O diagrama de classes da Finança Fácil tem como por exemplo esses atributos e métodos mostrados</w:t>
+      </w:r>
+      <w:r>
+        <w:rPr>
+          <w:rFonts w:asciiTheme="minorHAnsi" w:hAnsiTheme="minorHAnsi" w:cstheme="minorHAnsi"/>
+          <w:szCs w:val="24"/>
+        </w:rPr>
+        <w:t xml:space="preserve"> na </w:t>
+      </w:r>
+      <w:r>
+        <w:rPr>
+          <w:rFonts w:asciiTheme="minorHAnsi" w:hAnsiTheme="minorHAnsi" w:cstheme="minorHAnsi"/>
+          <w:szCs w:val="24"/>
+        </w:rPr>
+        <w:t>figura 1.</w:t>
       </w:r>
     </w:p>
     <w:p>
@@ -6204,12 +6450,20 @@
           <w:szCs w:val="24"/>
           <w:lang w:eastAsia="pt-BR"/>
         </w:rPr>
-        <w:lastRenderedPageBreak/>
+        <w:t xml:space="preserve"> </w:t>
+      </w:r>
+      <w:r>
+        <w:rPr>
+          <w:rFonts w:asciiTheme="minorHAnsi" w:hAnsiTheme="minorHAnsi" w:cstheme="minorHAnsi"/>
+          <w:noProof/>
+          <w:szCs w:val="24"/>
+          <w:lang w:eastAsia="pt-BR"/>
+        </w:rPr>
         <w:drawing>
-          <wp:inline distT="0" distB="0" distL="0" distR="0" wp14:anchorId="53B369E1" wp14:editId="32B89545">
-            <wp:extent cx="5760085" cy="5275385"/>
-            <wp:effectExtent l="0" t="0" r="0" b="1905"/>
-            <wp:docPr id="1" name="Imagem 1"/>
+          <wp:inline distT="0" distB="0" distL="0" distR="0" wp14:anchorId="011713E5" wp14:editId="5415A300">
+            <wp:extent cx="5760085" cy="5760085"/>
+            <wp:effectExtent l="0" t="0" r="0" b="0"/>
+            <wp:docPr id="9" name="Imagem 9"/>
             <wp:cNvGraphicFramePr>
               <a:graphicFrameLocks xmlns:a="http://schemas.openxmlformats.org/drawingml/2006/main" noChangeAspect="1"/>
             </wp:cNvGraphicFramePr>
@@ -6217,7 +6471,7 @@
               <a:graphicData uri="http://schemas.openxmlformats.org/drawingml/2006/picture">
                 <pic:pic xmlns:pic="http://schemas.openxmlformats.org/drawingml/2006/picture">
                   <pic:nvPicPr>
-                    <pic:cNvPr id="1" name="Diagrama de classes.drawio.png"/>
+                    <pic:cNvPr id="9" name="DiagramaAjustado.drawio.png"/>
                     <pic:cNvPicPr/>
                   </pic:nvPicPr>
                   <pic:blipFill>
@@ -6235,7 +6489,7 @@
                   <pic:spPr>
                     <a:xfrm>
                       <a:off x="0" y="0"/>
-                      <a:ext cx="5762583" cy="5277673"/>
+                      <a:ext cx="5760085" cy="5760085"/>
                     </a:xfrm>
                     <a:prstGeom prst="rect">
                       <a:avLst/>
@@ -6254,25 +6508,50 @@
         <w:jc w:val="both"/>
         <w:rPr>
           <w:rFonts w:asciiTheme="minorHAnsi" w:hAnsiTheme="minorHAnsi" w:cstheme="minorHAnsi"/>
-          <w:b/>
-          <w:szCs w:val="24"/>
-        </w:rPr>
-      </w:pPr>
-      <w:r>
-        <w:rPr>
-          <w:rFonts w:asciiTheme="minorHAnsi" w:hAnsiTheme="minorHAnsi" w:cstheme="minorHAnsi"/>
-          <w:b/>
-          <w:szCs w:val="24"/>
-        </w:rPr>
-        <w:t>3.2</w:t>
-      </w:r>
-      <w:r>
-        <w:rPr>
-          <w:rFonts w:asciiTheme="minorHAnsi" w:hAnsiTheme="minorHAnsi" w:cstheme="minorHAnsi"/>
-          <w:b/>
-          <w:szCs w:val="24"/>
-        </w:rPr>
-        <w:t xml:space="preserve"> DIAGRAMA DE CLASSE</w:t>
+          <w:szCs w:val="24"/>
+        </w:rPr>
+      </w:pPr>
+    </w:p>
+    <w:p>
+      <w:pPr>
+        <w:ind w:firstLine="0"/>
+        <w:jc w:val="both"/>
+        <w:rPr>
+          <w:rFonts w:asciiTheme="minorHAnsi" w:hAnsiTheme="minorHAnsi" w:cstheme="minorHAnsi"/>
+          <w:b/>
+          <w:szCs w:val="24"/>
+        </w:rPr>
+      </w:pPr>
+    </w:p>
+    <w:p>
+      <w:pPr>
+        <w:ind w:firstLine="0"/>
+        <w:jc w:val="both"/>
+        <w:rPr>
+          <w:rFonts w:asciiTheme="minorHAnsi" w:hAnsiTheme="minorHAnsi" w:cstheme="minorHAnsi"/>
+          <w:b/>
+          <w:szCs w:val="24"/>
+        </w:rPr>
+      </w:pPr>
+    </w:p>
+    <w:p>
+      <w:pPr>
+        <w:ind w:firstLine="0"/>
+        <w:jc w:val="both"/>
+        <w:rPr>
+          <w:rFonts w:asciiTheme="minorHAnsi" w:hAnsiTheme="minorHAnsi" w:cstheme="minorHAnsi"/>
+          <w:b/>
+          <w:szCs w:val="24"/>
+        </w:rPr>
+      </w:pPr>
+      <w:r>
+        <w:rPr>
+          <w:rFonts w:asciiTheme="minorHAnsi" w:hAnsiTheme="minorHAnsi" w:cstheme="minorHAnsi"/>
+          <w:b/>
+          <w:szCs w:val="24"/>
+        </w:rPr>
+        <w:lastRenderedPageBreak/>
+        <w:t>3.2 DIAGRAMA DE CLASSE</w:t>
       </w:r>
     </w:p>
     <w:p>
@@ -6300,8 +6579,6 @@
         </w:rPr>
         <w:t>O Diagrama Entidade-Relacionamento (DER) é crucial para planejar e estruturar a estrutura de um banco de dados, particularmente em sistemas de administração de finanças, assegurando eficácia, integridade e clareza nas conexões entre os dados.</w:t>
       </w:r>
-      <w:bookmarkStart w:id="0" w:name="_GoBack"/>
-      <w:bookmarkEnd w:id="0"/>
       <w:r>
         <w:rPr>
           <w:rFonts w:asciiTheme="minorHAnsi" w:hAnsiTheme="minorHAnsi" w:cstheme="minorHAnsi"/>
@@ -6353,8 +6630,8 @@
           </wp:inline>
         </w:drawing>
       </w:r>
-      <w:bookmarkStart w:id="1" w:name="_MON_1804494267"/>
-      <w:bookmarkEnd w:id="1"/>
+      <w:bookmarkStart w:id="0" w:name="_MON_1804494267"/>
+      <w:bookmarkEnd w:id="0"/>
       <w:r>
         <w:rPr>
           <w:rFonts w:asciiTheme="minorHAnsi" w:hAnsiTheme="minorHAnsi" w:cstheme="minorHAnsi"/>
@@ -6382,10 +6659,10 @@
             <v:path o:extrusionok="f" gradientshapeok="t" o:connecttype="rect"/>
             <o:lock v:ext="edit" aspectratio="t"/>
           </v:shapetype>
-          <v:shape id="_x0000_i1025" type="#_x0000_t75" style="width:453.6pt;height:696.75pt" o:ole="">
+          <v:shape id="_x0000_i1025" type="#_x0000_t75" style="width:454pt;height:697pt" o:ole="">
             <v:imagedata r:id="rId14" o:title=""/>
           </v:shape>
-          <o:OLEObject Type="Embed" ProgID="Word.Document.12" ShapeID="_x0000_i1025" DrawAspect="Content" ObjectID="_1804494732" r:id="rId15">
+          <o:OLEObject Type="Embed" ProgID="Word.Document.12" ShapeID="_x0000_i1025" DrawAspect="Content" ObjectID="_1804506079" r:id="rId15">
             <o:FieldCodes>\s</o:FieldCodes>
           </o:OLEObject>
         </w:object>
@@ -6426,7 +6703,6 @@
           <w:szCs w:val="24"/>
           <w:lang w:eastAsia="pt-BR"/>
         </w:rPr>
-        <w:lastRenderedPageBreak/>
         <w:drawing>
           <wp:inline distT="0" distB="0" distL="0" distR="0" wp14:anchorId="73757382" wp14:editId="2A850297">
             <wp:extent cx="5760085" cy="2740660"/>
@@ -6657,6 +6933,8 @@
           <w:szCs w:val="24"/>
         </w:rPr>
       </w:pPr>
+      <w:bookmarkStart w:id="1" w:name="_GoBack"/>
+      <w:bookmarkEnd w:id="1"/>
     </w:p>
     <w:sectPr>
       <w:pgSz w:w="11906" w:h="16838"/>
@@ -12423,6 +12701,7 @@
   <w:style w:type="character" w:default="1" w:styleId="Fontepargpadro">
     <w:name w:val="Default Paragraph Font"/>
     <w:uiPriority w:val="1"/>
+    <w:semiHidden/>
     <w:unhideWhenUsed/>
   </w:style>
   <w:style w:type="table" w:default="1" w:styleId="Tabelanormal">
@@ -12966,7 +13245,7 @@
 </file>
 
 <file path=customXml/itemProps1.xml><?xml version="1.0" encoding="utf-8"?>
-<ds:datastoreItem xmlns:ds="http://schemas.openxmlformats.org/officeDocument/2006/customXml" ds:itemID="{B6362B3F-9F46-45CA-B776-45AB37318B07}">
+<ds:datastoreItem xmlns:ds="http://schemas.openxmlformats.org/officeDocument/2006/customXml" ds:itemID="{66AACEB7-5A3D-417B-A40D-5C51B9F0FDC6}">
   <ds:schemaRefs>
     <ds:schemaRef ds:uri="http://schemas.openxmlformats.org/officeDocument/2006/bibliography"/>
   </ds:schemaRefs>

</xml_diff>

<commit_message>
Corrigindo um titulo 3, passando para 2.1.8
</commit_message>
<xml_diff>
--- a/docs/sistemas de gestão de finanças pessoais com metas - FINANÇAFACIL.docx
+++ b/docs/sistemas de gestão de finanças pessoais com metas - FINANÇAFACIL.docx
@@ -1368,6 +1368,13 @@
     </w:p>
     <w:sdt>
       <w:sdtPr>
+        <w:rPr>
+          <w:rFonts w:ascii="Arial" w:eastAsiaTheme="minorHAnsi" w:hAnsi="Arial" w:cstheme="minorBidi"/>
+          <w:color w:val="auto"/>
+          <w:sz w:val="24"/>
+          <w:szCs w:val="22"/>
+          <w:lang w:eastAsia="en-US"/>
+        </w:rPr>
         <w:id w:val="-690531006"/>
         <w:docPartObj>
           <w:docPartGallery w:val="Table of Contents"/>
@@ -1376,13 +1383,8 @@
       </w:sdtPr>
       <w:sdtEndPr>
         <w:rPr>
-          <w:rFonts w:ascii="Arial" w:eastAsiaTheme="minorHAnsi" w:hAnsi="Arial" w:cstheme="minorBidi"/>
           <w:b/>
           <w:bCs/>
-          <w:color w:val="auto"/>
-          <w:sz w:val="24"/>
-          <w:szCs w:val="22"/>
-          <w:lang w:eastAsia="en-US"/>
         </w:rPr>
       </w:sdtEndPr>
       <w:sdtContent>
@@ -2770,43 +2772,7 @@
           <w:szCs w:val="24"/>
           <w:bdr w:val="none" w:sz="0" w:space="0" w:color="auto" w:frame="1"/>
         </w:rPr>
-        <w:t xml:space="preserve">Os aplicativos Minhas Economias, </w:t>
-      </w:r>
-      <w:proofErr w:type="spellStart"/>
-      <w:r>
-        <w:rPr>
-          <w:rFonts w:asciiTheme="minorHAnsi" w:hAnsiTheme="minorHAnsi" w:cstheme="minorHAnsi"/>
-          <w:szCs w:val="24"/>
-          <w:bdr w:val="none" w:sz="0" w:space="0" w:color="auto" w:frame="1"/>
-        </w:rPr>
-        <w:t>Organizze</w:t>
-      </w:r>
-      <w:proofErr w:type="spellEnd"/>
-      <w:r>
-        <w:rPr>
-          <w:rFonts w:asciiTheme="minorHAnsi" w:hAnsiTheme="minorHAnsi" w:cstheme="minorHAnsi"/>
-          <w:szCs w:val="24"/>
-          <w:bdr w:val="none" w:sz="0" w:space="0" w:color="auto" w:frame="1"/>
-        </w:rPr>
-        <w:t xml:space="preserve"> e Wise oferecem soluções distintas para o gerenciamento financeiro. O Minhas Economias permite controlar despesas, receitas e investimentos, além de oferecer gráficos e um "gerenciador de sonhos" para metas financeiras. Ele também se destaca pela sincronização com contas bancárias e indicadores financeiros. Já o </w:t>
-      </w:r>
-      <w:proofErr w:type="spellStart"/>
-      <w:r>
-        <w:rPr>
-          <w:rFonts w:asciiTheme="minorHAnsi" w:hAnsiTheme="minorHAnsi" w:cstheme="minorHAnsi"/>
-          <w:szCs w:val="24"/>
-          <w:bdr w:val="none" w:sz="0" w:space="0" w:color="auto" w:frame="1"/>
-        </w:rPr>
-        <w:t>Organizze</w:t>
-      </w:r>
-      <w:proofErr w:type="spellEnd"/>
-      <w:r>
-        <w:rPr>
-          <w:rFonts w:asciiTheme="minorHAnsi" w:hAnsiTheme="minorHAnsi" w:cstheme="minorHAnsi"/>
-          <w:szCs w:val="24"/>
-          <w:bdr w:val="none" w:sz="0" w:space="0" w:color="auto" w:frame="1"/>
-        </w:rPr>
-        <w:t xml:space="preserve"> foca no controle de gastos diários e metas de orçamento, com uma interface simples e intuitiva. Por fim, o Wise é especializado em transferências internacionais e câmbio de moedas, sendo ideal para quem lida com transações em diferentes moedas. Cada um atende a uma necessidade específica de controle financeiro e gestão de recursos.</w:t>
+        <w:t>Os aplicativos Minhas Economias, Organizze e Wise oferecem soluções distintas para o gerenciamento financeiro. O Minhas Economias permite controlar despesas, receitas e investimentos, além de oferecer gráficos e um "gerenciador de sonhos" para metas financeiras. Ele também se destaca pela sincronização com contas bancárias e indicadores financeiros. Já o Organizze foca no controle de gastos diários e metas de orçamento, com uma interface simples e intuitiva. Por fim, o Wise é especializado em transferências internacionais e câmbio de moedas, sendo ideal para quem lida com transações em diferentes moedas. Cada um atende a uma necessidade específica de controle financeiro e gestão de recursos.</w:t>
       </w:r>
     </w:p>
     <w:p>
@@ -4964,23 +4930,7 @@
           <w:rFonts w:asciiTheme="minorHAnsi" w:hAnsiTheme="minorHAnsi" w:cstheme="minorHAnsi"/>
           <w:szCs w:val="24"/>
         </w:rPr>
-        <w:t xml:space="preserve">O sistema deve verificar se há metas ativas ou </w:t>
-      </w:r>
-      <w:proofErr w:type="gramStart"/>
-      <w:r>
-        <w:rPr>
-          <w:rFonts w:asciiTheme="minorHAnsi" w:hAnsiTheme="minorHAnsi" w:cstheme="minorHAnsi"/>
-          <w:szCs w:val="24"/>
-        </w:rPr>
-        <w:t>pendentes associadas</w:t>
-      </w:r>
-      <w:proofErr w:type="gramEnd"/>
-      <w:r>
-        <w:rPr>
-          <w:rFonts w:asciiTheme="minorHAnsi" w:hAnsiTheme="minorHAnsi" w:cstheme="minorHAnsi"/>
-          <w:szCs w:val="24"/>
-        </w:rPr>
-        <w:t xml:space="preserve"> ao cliente.</w:t>
+        <w:t>O sistema deve verificar se há metas ativas ou pendentes associadas ao cliente.</w:t>
       </w:r>
     </w:p>
     <w:p>
@@ -6795,7 +6745,10 @@
       </w:pPr>
       <w:bookmarkStart w:id="14" w:name="_Toc215060836"/>
       <w:r>
-        <w:t>2.3</w:t>
+        <w:t>2.</w:t>
+      </w:r>
+      <w:r>
+        <w:t>1</w:t>
       </w:r>
       <w:r>
         <w:t>.8</w:t>
@@ -7720,28 +7673,7 @@
                 <w:rFonts w:asciiTheme="minorHAnsi" w:hAnsiTheme="minorHAnsi" w:cstheme="minorHAnsi"/>
                 <w:szCs w:val="24"/>
               </w:rPr>
-              <w:t>RF</w:t>
-            </w:r>
-            <w:r>
-              <w:rPr>
-                <w:rFonts w:asciiTheme="minorHAnsi" w:hAnsiTheme="minorHAnsi" w:cstheme="minorHAnsi"/>
-                <w:szCs w:val="24"/>
-              </w:rPr>
-              <w:t>N</w:t>
-            </w:r>
-            <w:r>
-              <w:rPr>
-                <w:rFonts w:asciiTheme="minorHAnsi" w:hAnsiTheme="minorHAnsi" w:cstheme="minorHAnsi"/>
-                <w:szCs w:val="24"/>
-              </w:rPr>
-              <w:t>00</w:t>
-            </w:r>
-            <w:r>
-              <w:rPr>
-                <w:rFonts w:asciiTheme="minorHAnsi" w:hAnsiTheme="minorHAnsi" w:cstheme="minorHAnsi"/>
-                <w:szCs w:val="24"/>
-              </w:rPr>
-              <w:t>1</w:t>
+              <w:t>RFN001</w:t>
             </w:r>
           </w:p>
         </w:tc>
@@ -7779,24 +7711,14 @@
       <w:r>
         <w:t xml:space="preserve">Tabela </w:t>
       </w:r>
-      <w:r>
-        <w:fldChar w:fldCharType="begin"/>
-      </w:r>
-      <w:r>
-        <w:instrText xml:space="preserve"> SEQ Tabela \* ARABIC </w:instrText>
-      </w:r>
-      <w:r>
-        <w:fldChar w:fldCharType="separate"/>
-      </w:r>
-      <w:r>
-        <w:rPr>
-          <w:noProof/>
-        </w:rPr>
-        <w:t>2</w:t>
-      </w:r>
-      <w:r>
-        <w:fldChar w:fldCharType="end"/>
-      </w:r>
+      <w:fldSimple w:instr=" SEQ Tabela \* ARABIC ">
+        <w:r>
+          <w:rPr>
+            <w:noProof/>
+          </w:rPr>
+          <w:t>2</w:t>
+        </w:r>
+      </w:fldSimple>
       <w:r>
         <w:t xml:space="preserve"> - </w:t>
       </w:r>
@@ -7811,97 +7733,54 @@
       </w:pPr>
       <w:bookmarkStart w:id="18" w:name="_Toc215060839"/>
       <w:r>
-        <w:t>2.</w:t>
-      </w:r>
-      <w:r>
-        <w:t>2</w:t>
-      </w:r>
-      <w:r>
+        <w:t>2.2.1 RF003 – Conversor de moeda</w:t>
+      </w:r>
+      <w:bookmarkEnd w:id="18"/>
+    </w:p>
+    <w:p>
+      <w:pPr>
+        <w:jc w:val="both"/>
+        <w:rPr>
+          <w:rFonts w:asciiTheme="minorHAnsi" w:hAnsiTheme="minorHAnsi" w:cstheme="minorHAnsi"/>
+          <w:szCs w:val="24"/>
+        </w:rPr>
+      </w:pPr>
+      <w:r>
+        <w:rPr>
+          <w:rFonts w:asciiTheme="minorHAnsi" w:hAnsiTheme="minorHAnsi" w:cstheme="minorHAnsi"/>
+          <w:szCs w:val="24"/>
+        </w:rPr>
+        <w:t>Descrição: O sistema de</w:t>
+      </w:r>
+      <w:r>
+        <w:rPr>
+          <w:rFonts w:asciiTheme="minorHAnsi" w:hAnsiTheme="minorHAnsi" w:cstheme="minorHAnsi"/>
+          <w:szCs w:val="24"/>
+        </w:rPr>
+        <w:t>ve permitir que o usuário converte sua moeda para uma moeda desejada, mostrando o valor convertido</w:t>
+      </w:r>
+      <w:r>
+        <w:rPr>
+          <w:rFonts w:asciiTheme="minorHAnsi" w:hAnsiTheme="minorHAnsi" w:cstheme="minorHAnsi"/>
+          <w:szCs w:val="24"/>
+        </w:rPr>
         <w:t>.</w:t>
       </w:r>
-      <w:r>
-        <w:t>1</w:t>
-      </w:r>
-      <w:r>
-        <w:t xml:space="preserve"> RF003 – Co</w:t>
-      </w:r>
-      <w:r>
-        <w:t>nversor de moeda</w:t>
-      </w:r>
-      <w:bookmarkEnd w:id="18"/>
-    </w:p>
-    <w:p>
-      <w:pPr>
-        <w:jc w:val="both"/>
-        <w:rPr>
-          <w:rFonts w:asciiTheme="minorHAnsi" w:hAnsiTheme="minorHAnsi" w:cstheme="minorHAnsi"/>
-          <w:szCs w:val="24"/>
-        </w:rPr>
-      </w:pPr>
-      <w:r>
-        <w:rPr>
-          <w:rFonts w:asciiTheme="minorHAnsi" w:hAnsiTheme="minorHAnsi" w:cstheme="minorHAnsi"/>
-          <w:szCs w:val="24"/>
-        </w:rPr>
-        <w:t>Descrição: O sistema de</w:t>
-      </w:r>
-      <w:r>
-        <w:rPr>
-          <w:rFonts w:asciiTheme="minorHAnsi" w:hAnsiTheme="minorHAnsi" w:cstheme="minorHAnsi"/>
-          <w:szCs w:val="24"/>
-        </w:rPr>
-        <w:t xml:space="preserve">ve permitir que o usuário </w:t>
-      </w:r>
-      <w:r>
-        <w:rPr>
-          <w:rFonts w:asciiTheme="minorHAnsi" w:hAnsiTheme="minorHAnsi" w:cstheme="minorHAnsi"/>
-          <w:szCs w:val="24"/>
-        </w:rPr>
-        <w:t>converte sua moeda para uma moeda desejada</w:t>
-      </w:r>
-      <w:r>
-        <w:rPr>
-          <w:rFonts w:asciiTheme="minorHAnsi" w:hAnsiTheme="minorHAnsi" w:cstheme="minorHAnsi"/>
-          <w:szCs w:val="24"/>
-        </w:rPr>
-        <w:t>, mostrando</w:t>
-      </w:r>
-      <w:r>
-        <w:rPr>
-          <w:rFonts w:asciiTheme="minorHAnsi" w:hAnsiTheme="minorHAnsi" w:cstheme="minorHAnsi"/>
-          <w:szCs w:val="24"/>
-        </w:rPr>
-        <w:t xml:space="preserve"> o valor convertido</w:t>
-      </w:r>
-      <w:r>
-        <w:rPr>
-          <w:rFonts w:asciiTheme="minorHAnsi" w:hAnsiTheme="minorHAnsi" w:cstheme="minorHAnsi"/>
-          <w:szCs w:val="24"/>
-        </w:rPr>
-        <w:t>.</w:t>
-      </w:r>
-    </w:p>
-    <w:p>
-      <w:pPr>
-        <w:jc w:val="both"/>
-        <w:rPr>
-          <w:rFonts w:asciiTheme="minorHAnsi" w:hAnsiTheme="minorHAnsi" w:cstheme="minorHAnsi"/>
-          <w:szCs w:val="24"/>
-        </w:rPr>
-      </w:pPr>
-      <w:r>
-        <w:rPr>
-          <w:rFonts w:asciiTheme="minorHAnsi" w:hAnsiTheme="minorHAnsi" w:cstheme="minorHAnsi"/>
-          <w:szCs w:val="24"/>
-        </w:rPr>
-        <w:t xml:space="preserve">Prioridade: </w:t>
-      </w:r>
-      <w:r>
-        <w:rPr>
-          <w:rFonts w:asciiTheme="minorHAnsi" w:hAnsiTheme="minorHAnsi" w:cstheme="minorHAnsi"/>
-          <w:szCs w:val="24"/>
-        </w:rPr>
-        <w:t>Baixa</w:t>
+    </w:p>
+    <w:p>
+      <w:pPr>
+        <w:jc w:val="both"/>
+        <w:rPr>
+          <w:rFonts w:asciiTheme="minorHAnsi" w:hAnsiTheme="minorHAnsi" w:cstheme="minorHAnsi"/>
+          <w:szCs w:val="24"/>
+        </w:rPr>
+      </w:pPr>
+      <w:r>
+        <w:rPr>
+          <w:rFonts w:asciiTheme="minorHAnsi" w:hAnsiTheme="minorHAnsi" w:cstheme="minorHAnsi"/>
+          <w:szCs w:val="24"/>
+        </w:rPr>
+        <w:t>Prioridade: Baixa</w:t>
       </w:r>
     </w:p>
     <w:p>
@@ -7982,28 +7861,7 @@
           <w:rFonts w:asciiTheme="minorHAnsi" w:hAnsiTheme="minorHAnsi" w:cstheme="minorHAnsi"/>
           <w:szCs w:val="24"/>
         </w:rPr>
-        <w:t xml:space="preserve">deve verificar se </w:t>
-      </w:r>
-      <w:r>
-        <w:rPr>
-          <w:rFonts w:asciiTheme="minorHAnsi" w:hAnsiTheme="minorHAnsi" w:cstheme="minorHAnsi"/>
-          <w:szCs w:val="24"/>
-        </w:rPr>
-        <w:t>h</w:t>
-      </w:r>
-      <w:r>
-        <w:rPr>
-          <w:rFonts w:asciiTheme="minorHAnsi" w:hAnsiTheme="minorHAnsi" w:cstheme="minorHAnsi"/>
-          <w:szCs w:val="24"/>
-        </w:rPr>
-        <w:t xml:space="preserve">á </w:t>
-      </w:r>
-      <w:r>
-        <w:rPr>
-          <w:rFonts w:asciiTheme="minorHAnsi" w:hAnsiTheme="minorHAnsi" w:cstheme="minorHAnsi"/>
-          <w:szCs w:val="24"/>
-        </w:rPr>
-        <w:t>dados do valor da moeda</w:t>
+        <w:t>deve verificar se há dados do valor da moeda</w:t>
       </w:r>
       <w:r>
         <w:rPr>
@@ -8038,28 +7896,7 @@
           <w:rFonts w:asciiTheme="minorHAnsi" w:hAnsiTheme="minorHAnsi" w:cstheme="minorHAnsi"/>
           <w:szCs w:val="24"/>
         </w:rPr>
-        <w:t xml:space="preserve"> o sistema deve </w:t>
-      </w:r>
-      <w:r>
-        <w:rPr>
-          <w:rFonts w:asciiTheme="minorHAnsi" w:hAnsiTheme="minorHAnsi" w:cstheme="minorHAnsi"/>
-          <w:szCs w:val="24"/>
-        </w:rPr>
-        <w:t>converter</w:t>
-      </w:r>
-      <w:r>
-        <w:rPr>
-          <w:rFonts w:asciiTheme="minorHAnsi" w:hAnsiTheme="minorHAnsi" w:cstheme="minorHAnsi"/>
-          <w:szCs w:val="24"/>
-        </w:rPr>
-        <w:t xml:space="preserve"> a </w:t>
-      </w:r>
-      <w:r>
-        <w:rPr>
-          <w:rFonts w:asciiTheme="minorHAnsi" w:hAnsiTheme="minorHAnsi" w:cstheme="minorHAnsi"/>
-          <w:szCs w:val="24"/>
-        </w:rPr>
-        <w:t>moeda e exibir</w:t>
+        <w:t xml:space="preserve"> o sistema deve converter a moeda e exibir</w:t>
       </w:r>
       <w:r>
         <w:rPr>
@@ -8131,84 +7968,7 @@
           <w:rFonts w:asciiTheme="minorHAnsi" w:hAnsiTheme="minorHAnsi" w:cstheme="minorHAnsi"/>
           <w:szCs w:val="24"/>
         </w:rPr>
-        <w:t xml:space="preserve">Mensagem de erro ao </w:t>
-      </w:r>
-      <w:r>
-        <w:rPr>
-          <w:rFonts w:asciiTheme="minorHAnsi" w:hAnsiTheme="minorHAnsi" w:cstheme="minorHAnsi"/>
-          <w:szCs w:val="24"/>
-        </w:rPr>
-        <w:t>converter</w:t>
-      </w:r>
-      <w:r>
-        <w:rPr>
-          <w:rFonts w:asciiTheme="minorHAnsi" w:hAnsiTheme="minorHAnsi" w:cstheme="minorHAnsi"/>
-          <w:szCs w:val="24"/>
-        </w:rPr>
-        <w:t xml:space="preserve"> </w:t>
-      </w:r>
-      <w:r>
-        <w:rPr>
-          <w:rFonts w:asciiTheme="minorHAnsi" w:hAnsiTheme="minorHAnsi" w:cstheme="minorHAnsi"/>
-          <w:szCs w:val="24"/>
-        </w:rPr>
-        <w:t>a</w:t>
-      </w:r>
-      <w:r>
-        <w:rPr>
-          <w:rFonts w:asciiTheme="minorHAnsi" w:hAnsiTheme="minorHAnsi" w:cstheme="minorHAnsi"/>
-          <w:szCs w:val="24"/>
-        </w:rPr>
-        <w:t xml:space="preserve"> </w:t>
-      </w:r>
-      <w:r>
-        <w:rPr>
-          <w:rFonts w:asciiTheme="minorHAnsi" w:hAnsiTheme="minorHAnsi" w:cstheme="minorHAnsi"/>
-          <w:szCs w:val="24"/>
-        </w:rPr>
-        <w:t>moeda</w:t>
-      </w:r>
-      <w:r>
-        <w:rPr>
-          <w:rFonts w:asciiTheme="minorHAnsi" w:hAnsiTheme="minorHAnsi" w:cstheme="minorHAnsi"/>
-          <w:szCs w:val="24"/>
-        </w:rPr>
-        <w:t xml:space="preserve">, se houver algum erro relacionado a </w:t>
-      </w:r>
-      <w:r>
-        <w:rPr>
-          <w:rFonts w:asciiTheme="minorHAnsi" w:hAnsiTheme="minorHAnsi" w:cstheme="minorHAnsi"/>
-          <w:szCs w:val="24"/>
-        </w:rPr>
-        <w:t>captação</w:t>
-      </w:r>
-      <w:r>
-        <w:rPr>
-          <w:rFonts w:asciiTheme="minorHAnsi" w:hAnsiTheme="minorHAnsi" w:cstheme="minorHAnsi"/>
-          <w:szCs w:val="24"/>
-        </w:rPr>
-        <w:t xml:space="preserve"> do</w:t>
-      </w:r>
-      <w:r>
-        <w:rPr>
-          <w:rFonts w:asciiTheme="minorHAnsi" w:hAnsiTheme="minorHAnsi" w:cstheme="minorHAnsi"/>
-          <w:szCs w:val="24"/>
-        </w:rPr>
-        <w:t>s</w:t>
-      </w:r>
-      <w:r>
-        <w:rPr>
-          <w:rFonts w:asciiTheme="minorHAnsi" w:hAnsiTheme="minorHAnsi" w:cstheme="minorHAnsi"/>
-          <w:szCs w:val="24"/>
-        </w:rPr>
-        <w:t xml:space="preserve"> </w:t>
-      </w:r>
-      <w:r>
-        <w:rPr>
-          <w:rFonts w:asciiTheme="minorHAnsi" w:hAnsiTheme="minorHAnsi" w:cstheme="minorHAnsi"/>
-          <w:szCs w:val="24"/>
-        </w:rPr>
-        <w:t>valores.</w:t>
+        <w:t>Mensagem de erro ao converter a moeda, se houver algum erro relacionado a captação dos valores.</w:t>
       </w:r>
     </w:p>
     <w:p>
@@ -8245,35 +8005,7 @@
           <w:rFonts w:asciiTheme="minorHAnsi" w:hAnsiTheme="minorHAnsi" w:cstheme="minorHAnsi"/>
           <w:szCs w:val="24"/>
         </w:rPr>
-        <w:t xml:space="preserve">O </w:t>
-      </w:r>
-      <w:r>
-        <w:rPr>
-          <w:rFonts w:asciiTheme="minorHAnsi" w:hAnsiTheme="minorHAnsi" w:cstheme="minorHAnsi"/>
-          <w:szCs w:val="24"/>
-        </w:rPr>
-        <w:t>valor</w:t>
-      </w:r>
-      <w:r>
-        <w:rPr>
-          <w:rFonts w:asciiTheme="minorHAnsi" w:hAnsiTheme="minorHAnsi" w:cstheme="minorHAnsi"/>
-          <w:szCs w:val="24"/>
-        </w:rPr>
-        <w:t xml:space="preserve"> deve ser exibido em forma de </w:t>
-      </w:r>
-      <w:r>
-        <w:rPr>
-          <w:rFonts w:asciiTheme="minorHAnsi" w:hAnsiTheme="minorHAnsi" w:cstheme="minorHAnsi"/>
-          <w:szCs w:val="24"/>
-        </w:rPr>
-        <w:t>texto</w:t>
-      </w:r>
-      <w:r>
-        <w:rPr>
-          <w:rFonts w:asciiTheme="minorHAnsi" w:hAnsiTheme="minorHAnsi" w:cstheme="minorHAnsi"/>
-          <w:szCs w:val="24"/>
-        </w:rPr>
-        <w:t>.</w:t>
+        <w:t>O valor deve ser exibido em forma de texto.</w:t>
       </w:r>
     </w:p>
     <w:p>
@@ -8349,55 +8081,7 @@
           <w:rFonts w:asciiTheme="minorHAnsi" w:hAnsiTheme="minorHAnsi" w:cstheme="minorHAnsi"/>
           <w:szCs w:val="24"/>
         </w:rPr>
-        <w:t xml:space="preserve">odelagem do de software é uma etapa fundamental no desenvolvimento de sistemas, permitindo a criação de representações estruturadas dos componentes, como Diagramas de classes (define a estrutura do </w:t>
-      </w:r>
-      <w:proofErr w:type="spellStart"/>
-      <w:r>
-        <w:rPr>
-          <w:rFonts w:asciiTheme="minorHAnsi" w:hAnsiTheme="minorHAnsi" w:cstheme="minorHAnsi"/>
-          <w:szCs w:val="24"/>
-        </w:rPr>
-        <w:t>back-end</w:t>
-      </w:r>
-      <w:proofErr w:type="spellEnd"/>
-      <w:r>
-        <w:rPr>
-          <w:rFonts w:asciiTheme="minorHAnsi" w:hAnsiTheme="minorHAnsi" w:cstheme="minorHAnsi"/>
-          <w:szCs w:val="24"/>
-        </w:rPr>
-        <w:t xml:space="preserve">, organizando as classes, atributos, métodos e relações antes da implementação), Diagramas de entidade e relacionamento (DER) (modela a estrutura do banco de dados, garantindo a integridade e organização das informações) e o </w:t>
-      </w:r>
-      <w:proofErr w:type="spellStart"/>
-      <w:r>
-        <w:rPr>
-          <w:rFonts w:asciiTheme="minorHAnsi" w:hAnsiTheme="minorHAnsi" w:cstheme="minorHAnsi"/>
-          <w:szCs w:val="24"/>
-        </w:rPr>
-        <w:t>Mockup</w:t>
-      </w:r>
-      <w:proofErr w:type="spellEnd"/>
-      <w:r>
-        <w:rPr>
-          <w:rFonts w:asciiTheme="minorHAnsi" w:hAnsiTheme="minorHAnsi" w:cstheme="minorHAnsi"/>
-          <w:szCs w:val="24"/>
-        </w:rPr>
-        <w:t xml:space="preserve"> (representa a estrutura do front-</w:t>
-      </w:r>
-      <w:proofErr w:type="spellStart"/>
-      <w:r>
-        <w:rPr>
-          <w:rFonts w:asciiTheme="minorHAnsi" w:hAnsiTheme="minorHAnsi" w:cstheme="minorHAnsi"/>
-          <w:szCs w:val="24"/>
-        </w:rPr>
-        <w:t>end</w:t>
-      </w:r>
-      <w:proofErr w:type="spellEnd"/>
-      <w:r>
-        <w:rPr>
-          <w:rFonts w:asciiTheme="minorHAnsi" w:hAnsiTheme="minorHAnsi" w:cstheme="minorHAnsi"/>
-          <w:szCs w:val="24"/>
-        </w:rPr>
-        <w:t xml:space="preserve">, ajudando na definição da interface do usuário antes da implementação), </w:t>
+        <w:t xml:space="preserve">odelagem do de software é uma etapa fundamental no desenvolvimento de sistemas, permitindo a criação de representações estruturadas dos componentes, como Diagramas de classes (define a estrutura do back-end, organizando as classes, atributos, métodos e relações antes da implementação), Diagramas de entidade e relacionamento (DER) (modela a estrutura do banco de dados, garantindo a integridade e organização das informações) e o Mockup (representa a estrutura do front-end, ajudando na definição da interface do usuário antes da implementação), </w:t>
       </w:r>
       <w:r>
         <w:rPr>
@@ -8452,23 +8136,7 @@
           <w:rFonts w:asciiTheme="minorHAnsi" w:hAnsiTheme="minorHAnsi" w:cstheme="minorHAnsi"/>
           <w:szCs w:val="24"/>
         </w:rPr>
-        <w:t xml:space="preserve">O diagrama de classes organiza as partes do sistema, como "Cliente", "Metas" e "Banco", mostrando suas relações. Auxiliando o programador na hora do </w:t>
-      </w:r>
-      <w:proofErr w:type="spellStart"/>
-      <w:r>
-        <w:rPr>
-          <w:rFonts w:asciiTheme="minorHAnsi" w:hAnsiTheme="minorHAnsi" w:cstheme="minorHAnsi"/>
-          <w:szCs w:val="24"/>
-        </w:rPr>
-        <w:t>back-end</w:t>
-      </w:r>
-      <w:proofErr w:type="spellEnd"/>
-      <w:r>
-        <w:rPr>
-          <w:rFonts w:asciiTheme="minorHAnsi" w:hAnsiTheme="minorHAnsi" w:cstheme="minorHAnsi"/>
-          <w:szCs w:val="24"/>
-        </w:rPr>
-        <w:t>, na criação dos atributos e métodos, mostrando claramente o que devemos fazer, como os parâmetros das funções serão e como se relacionarão. O diagrama de classes da Finança Fácil tem como por exemplo esses atributos e métodos mostrados</w:t>
+        <w:t>O diagrama de classes organiza as partes do sistema, como "Cliente", "Metas" e "Banco", mostrando suas relações. Auxiliando o programador na hora do back-end, na criação dos atributos e métodos, mostrando claramente o que devemos fazer, como os parâmetros das funções serão e como se relacionarão. O diagrama de classes da Finança Fácil tem como por exemplo esses atributos e métodos mostrados</w:t>
       </w:r>
       <w:r>
         <w:rPr>
@@ -8742,7 +8410,7 @@
           <v:shape id="_x0000_i1025" type="#_x0000_t75" style="width:454pt;height:697pt" o:ole="">
             <v:imagedata r:id="rId14" o:title=""/>
           </v:shape>
-          <o:OLEObject Type="Embed" ProgID="Word.Document.12" ShapeID="_x0000_i1025" DrawAspect="Content" ObjectID="_1825673891" r:id="rId15">
+          <o:OLEObject Type="Embed" ProgID="Word.Document.12" ShapeID="_x0000_i1025" DrawAspect="Content" ObjectID="_1825674235" r:id="rId15">
             <o:FieldCodes>\s</o:FieldCodes>
           </o:OLEObject>
         </w:object>

</xml_diff>